<commit_message>
Updated the README.md and documentation details in report
</commit_message>
<xml_diff>
--- a/Evidence/Components that refuse to be cached in CacheView.docx
+++ b/Evidence/Components that refuse to be cached in CacheView.docx
@@ -165,9 +165,92 @@
         <w:t>Outcome:</w:t>
       </w:r>
       <w:r>
-        <w:t xml:space="preserve"> Works</w:t>
+        <w:t xml:space="preserve"> </w:t>
+      </w:r>
+      <w:r>
+        <w:t>Validation Passed</w:t>
       </w:r>
     </w:p>
+    <w:p>
+      <w:pPr>
+        <w:spacing w:line="240" w:lineRule="auto"/>
+        <w:rPr>
+          <w:sz w:val="28"/>
+          <w:szCs w:val="28"/>
+        </w:rPr>
+      </w:pPr>
+    </w:p>
+    <w:p>
+      <w:pPr>
+        <w:spacing w:line="240" w:lineRule="auto"/>
+        <w:rPr>
+          <w:sz w:val="28"/>
+          <w:szCs w:val="28"/>
+        </w:rPr>
+      </w:pPr>
+      <w:r>
+        <w:rPr>
+          <w:sz w:val="28"/>
+          <w:szCs w:val="28"/>
+        </w:rPr>
+        <w:t>.</w:t>
+      </w:r>
+      <w:r>
+        <w:rPr>
+          <w:b/>
+          <w:bCs/>
+          <w:sz w:val="28"/>
+          <w:szCs w:val="28"/>
+        </w:rPr>
+        <w:t>NET SDK Detail:</w:t>
+      </w:r>
+    </w:p>
+    <w:p>
+      <w:pPr>
+        <w:spacing w:line="240" w:lineRule="auto"/>
+      </w:pPr>
+      <w:r>
+        <w:rPr>
+          <w:noProof/>
+        </w:rPr>
+        <w:drawing>
+          <wp:inline distT="0" distB="0" distL="0" distR="0" wp14:anchorId="1FF4B313" wp14:editId="0986AC1C">
+            <wp:extent cx="4632148" cy="2377440"/>
+            <wp:effectExtent l="0" t="0" r="0" b="3810"/>
+            <wp:docPr id="1344531848" name="Picture 1"/>
+            <wp:cNvGraphicFramePr>
+              <a:graphicFrameLocks xmlns:a="http://schemas.openxmlformats.org/drawingml/2006/main" noChangeAspect="1"/>
+            </wp:cNvGraphicFramePr>
+            <a:graphic xmlns:a="http://schemas.openxmlformats.org/drawingml/2006/main">
+              <a:graphicData uri="http://schemas.openxmlformats.org/drawingml/2006/picture">
+                <pic:pic xmlns:pic="http://schemas.openxmlformats.org/drawingml/2006/picture">
+                  <pic:nvPicPr>
+                    <pic:cNvPr id="1344531848" name=""/>
+                    <pic:cNvPicPr/>
+                  </pic:nvPicPr>
+                  <pic:blipFill>
+                    <a:blip r:embed="rId6"/>
+                    <a:stretch>
+                      <a:fillRect/>
+                    </a:stretch>
+                  </pic:blipFill>
+                  <pic:spPr>
+                    <a:xfrm>
+                      <a:off x="0" y="0"/>
+                      <a:ext cx="4634246" cy="2378517"/>
+                    </a:xfrm>
+                    <a:prstGeom prst="rect">
+                      <a:avLst/>
+                    </a:prstGeom>
+                  </pic:spPr>
+                </pic:pic>
+              </a:graphicData>
+            </a:graphic>
+          </wp:inline>
+        </w:drawing>
+      </w:r>
+    </w:p>
+    <w:p/>
     <w:p>
       <w:pPr>
         <w:rPr>
@@ -199,10 +282,7 @@
         <w:t>This validation was performed manually through browser-based testing in Static SSR</w:t>
       </w:r>
       <w:r>
-        <w:t xml:space="preserve"> </w:t>
-      </w:r>
-      <w:r>
-        <w:t>application</w:t>
+        <w:t xml:space="preserve"> application</w:t>
       </w:r>
       <w:r>
         <w:t>.</w:t>
@@ -236,6 +316,7 @@
           <w:sz w:val="32"/>
           <w:szCs w:val="32"/>
         </w:rPr>
+        <w:lastRenderedPageBreak/>
         <w:t>Checks:</w:t>
       </w:r>
     </w:p>
@@ -246,10 +327,10 @@
         <w:tblLook w:val="04A0" w:firstRow="1" w:lastRow="0" w:firstColumn="1" w:lastColumn="0" w:noHBand="0" w:noVBand="1"/>
       </w:tblPr>
       <w:tblGrid>
-        <w:gridCol w:w="548"/>
-        <w:gridCol w:w="3168"/>
-        <w:gridCol w:w="1144"/>
-        <w:gridCol w:w="4490"/>
+        <w:gridCol w:w="532"/>
+        <w:gridCol w:w="2613"/>
+        <w:gridCol w:w="1088"/>
+        <w:gridCol w:w="5117"/>
       </w:tblGrid>
       <w:tr>
         <w:tc>
@@ -475,7 +556,7 @@
           </w:tcPr>
           <w:p>
             <w:pPr>
-              <w:spacing w:after="160" w:line="278" w:lineRule="auto"/>
+              <w:spacing w:line="278" w:lineRule="auto"/>
             </w:pPr>
             <w:proofErr w:type="spellStart"/>
             <w:r>
@@ -516,6 +597,26 @@
             <w:proofErr w:type="spellEnd"/>
             <w:r>
               <w:t>.</w:t>
+            </w:r>
+            <w:r>
+              <w:t xml:space="preserve"> </w:t>
+            </w:r>
+            <w:r>
+              <w:t xml:space="preserve">Refer to </w:t>
+            </w:r>
+            <w:hyperlink r:id="rId7" w:history="1">
+              <w:r>
+                <w:rPr>
+                  <w:rStyle w:val="Hyperlink"/>
+                </w:rPr>
+                <w:t>AuthorizeView_Refusal.png</w:t>
+              </w:r>
+            </w:hyperlink>
+            <w:r>
+              <w:t xml:space="preserve"> </w:t>
+            </w:r>
+            <w:r>
+              <w:t xml:space="preserve">for the complete exception message. </w:t>
             </w:r>
           </w:p>
         </w:tc>
@@ -531,7 +632,6 @@
               <w:spacing w:after="160" w:line="278" w:lineRule="auto"/>
             </w:pPr>
             <w:r>
-              <w:lastRenderedPageBreak/>
               <w:t>3</w:t>
             </w:r>
           </w:p>
@@ -715,6 +815,26 @@
             <w:r>
               <w:t>.</w:t>
             </w:r>
+            <w:r>
+              <w:t xml:space="preserve"> </w:t>
+            </w:r>
+            <w:r>
+              <w:t xml:space="preserve">Refer to </w:t>
+            </w:r>
+            <w:hyperlink r:id="rId8" w:history="1">
+              <w:r>
+                <w:rPr>
+                  <w:rStyle w:val="Hyperlink"/>
+                </w:rPr>
+                <w:t>QuickGrid_Refusal.png</w:t>
+              </w:r>
+            </w:hyperlink>
+            <w:r>
+              <w:t xml:space="preserve"> </w:t>
+            </w:r>
+            <w:r>
+              <w:t>for the complete exception message.</w:t>
+            </w:r>
           </w:p>
         </w:tc>
       </w:tr>
@@ -976,6 +1096,26 @@
             <w:r>
               <w:t>.</w:t>
             </w:r>
+            <w:r>
+              <w:t xml:space="preserve"> </w:t>
+            </w:r>
+            <w:r>
+              <w:t xml:space="preserve">Refer to </w:t>
+            </w:r>
+            <w:hyperlink r:id="rId9" w:history="1">
+              <w:r>
+                <w:rPr>
+                  <w:rStyle w:val="Hyperlink"/>
+                </w:rPr>
+                <w:t>UserBadge_Refusal.png</w:t>
+              </w:r>
+            </w:hyperlink>
+            <w:r>
+              <w:t xml:space="preserve"> </w:t>
+            </w:r>
+            <w:r>
+              <w:t>for the complete exception message.</w:t>
+            </w:r>
           </w:p>
         </w:tc>
       </w:tr>
@@ -990,6 +1130,7 @@
               <w:spacing w:after="160" w:line="278" w:lineRule="auto"/>
             </w:pPr>
             <w:r>
+              <w:lastRenderedPageBreak/>
               <w:t>8</w:t>
             </w:r>
           </w:p>
@@ -1087,6 +1228,26 @@
             </w:r>
             <w:r>
               <w:t>.</w:t>
+            </w:r>
+            <w:r>
+              <w:t xml:space="preserve"> </w:t>
+            </w:r>
+            <w:r>
+              <w:t xml:space="preserve">Refer to </w:t>
+            </w:r>
+            <w:hyperlink r:id="rId10" w:history="1">
+              <w:r>
+                <w:rPr>
+                  <w:rStyle w:val="Hyperlink"/>
+                </w:rPr>
+                <w:t>UserBadge_VaryByConfigured_Refusal.png</w:t>
+              </w:r>
+            </w:hyperlink>
+            <w:r>
+              <w:t xml:space="preserve"> </w:t>
+            </w:r>
+            <w:r>
+              <w:t>for the complete exception message.</w:t>
             </w:r>
           </w:p>
         </w:tc>
@@ -1338,7 +1499,6 @@
               <w:spacing w:after="160" w:line="278" w:lineRule="auto"/>
             </w:pPr>
             <w:r>
-              <w:lastRenderedPageBreak/>
               <w:t>12</w:t>
             </w:r>
           </w:p>
@@ -1478,6 +1638,26 @@
             <w:proofErr w:type="spellEnd"/>
             <w:r>
               <w:t xml:space="preserve"> components are not supported.</w:t>
+            </w:r>
+            <w:r>
+              <w:t xml:space="preserve"> </w:t>
+            </w:r>
+            <w:r>
+              <w:t xml:space="preserve">Refer to </w:t>
+            </w:r>
+            <w:hyperlink r:id="rId11" w:history="1">
+              <w:r>
+                <w:rPr>
+                  <w:rStyle w:val="Hyperlink"/>
+                </w:rPr>
+                <w:t>NestedCacheView_Refusal.png</w:t>
+              </w:r>
+            </w:hyperlink>
+            <w:r>
+              <w:t xml:space="preserve"> </w:t>
+            </w:r>
+            <w:r>
+              <w:t>for the complete exception message.</w:t>
             </w:r>
           </w:p>
         </w:tc>
@@ -1543,13 +1723,34 @@
     </w:tbl>
     <w:p/>
     <w:p>
-      <w:r>
+      <w:pPr>
         <w:rPr>
           <w:b/>
           <w:bCs/>
           <w:sz w:val="32"/>
           <w:szCs w:val="32"/>
         </w:rPr>
+      </w:pPr>
+    </w:p>
+    <w:p>
+      <w:pPr>
+        <w:rPr>
+          <w:b/>
+          <w:bCs/>
+          <w:sz w:val="32"/>
+          <w:szCs w:val="32"/>
+        </w:rPr>
+      </w:pPr>
+    </w:p>
+    <w:p>
+      <w:r>
+        <w:rPr>
+          <w:b/>
+          <w:bCs/>
+          <w:sz w:val="32"/>
+          <w:szCs w:val="32"/>
+        </w:rPr>
+        <w:lastRenderedPageBreak/>
         <w:t>Evidence</w:t>
       </w:r>
     </w:p>
@@ -1566,7 +1767,7 @@
       <w:tr>
         <w:tc>
           <w:tcPr>
-            <w:tcW w:w="4405" w:type="dxa"/>
+            <w:tcW w:w="4112" w:type="dxa"/>
             <w:hideMark/>
           </w:tcPr>
           <w:p>
@@ -1588,7 +1789,7 @@
         </w:tc>
         <w:tc>
           <w:tcPr>
-            <w:tcW w:w="4945" w:type="dxa"/>
+            <w:tcW w:w="5238" w:type="dxa"/>
             <w:hideMark/>
           </w:tcPr>
           <w:p>
@@ -1612,7 +1813,7 @@
       <w:tr>
         <w:tc>
           <w:tcPr>
-            <w:tcW w:w="4405" w:type="dxa"/>
+            <w:tcW w:w="4112" w:type="dxa"/>
             <w:hideMark/>
           </w:tcPr>
           <w:p>
@@ -1636,14 +1837,14 @@
         </w:tc>
         <w:tc>
           <w:tcPr>
-            <w:tcW w:w="4945" w:type="dxa"/>
-            <w:hideMark/>
-          </w:tcPr>
-          <w:p>
-            <w:pPr>
-              <w:spacing w:after="160" w:line="278" w:lineRule="auto"/>
-            </w:pPr>
-            <w:hyperlink r:id="rId6" w:history="1">
+            <w:tcW w:w="5238" w:type="dxa"/>
+            <w:hideMark/>
+          </w:tcPr>
+          <w:p>
+            <w:pPr>
+              <w:spacing w:after="160" w:line="278" w:lineRule="auto"/>
+            </w:pPr>
+            <w:hyperlink r:id="rId12" w:history="1">
               <w:r>
                 <w:rPr>
                   <w:rStyle w:val="Hyperlink"/>
@@ -1657,7 +1858,7 @@
       <w:tr>
         <w:tc>
           <w:tcPr>
-            <w:tcW w:w="4405" w:type="dxa"/>
+            <w:tcW w:w="4112" w:type="dxa"/>
             <w:hideMark/>
           </w:tcPr>
           <w:p>
@@ -1681,25 +1882,19 @@
         </w:tc>
         <w:tc>
           <w:tcPr>
-            <w:tcW w:w="4945" w:type="dxa"/>
-            <w:hideMark/>
-          </w:tcPr>
-          <w:p>
-            <w:pPr>
-              <w:spacing w:after="160" w:line="278" w:lineRule="auto"/>
-            </w:pPr>
-            <w:hyperlink r:id="rId7" w:history="1">
+            <w:tcW w:w="5238" w:type="dxa"/>
+            <w:hideMark/>
+          </w:tcPr>
+          <w:p>
+            <w:pPr>
+              <w:spacing w:after="160" w:line="278" w:lineRule="auto"/>
+            </w:pPr>
+            <w:hyperlink r:id="rId13" w:history="1">
               <w:r>
                 <w:rPr>
                   <w:rStyle w:val="Hyperlink"/>
                 </w:rPr>
-                <w:t>AuthorizeView_VaryByUser_Fixed.</w:t>
-              </w:r>
-              <w:r>
-                <w:rPr>
-                  <w:rStyle w:val="Hyperlink"/>
-                </w:rPr>
-                <w:t>mp4</w:t>
+                <w:t>AuthorizeView_VaryByUser_Fixed.mp4</w:t>
               </w:r>
             </w:hyperlink>
           </w:p>
@@ -1708,7 +1903,7 @@
       <w:tr>
         <w:tc>
           <w:tcPr>
-            <w:tcW w:w="4405" w:type="dxa"/>
+            <w:tcW w:w="4112" w:type="dxa"/>
             <w:hideMark/>
           </w:tcPr>
           <w:p>
@@ -1732,14 +1927,14 @@
         </w:tc>
         <w:tc>
           <w:tcPr>
-            <w:tcW w:w="4945" w:type="dxa"/>
-            <w:hideMark/>
-          </w:tcPr>
-          <w:p>
-            <w:pPr>
-              <w:spacing w:after="160" w:line="278" w:lineRule="auto"/>
-            </w:pPr>
-            <w:hyperlink r:id="rId8" w:history="1">
+            <w:tcW w:w="5238" w:type="dxa"/>
+            <w:hideMark/>
+          </w:tcPr>
+          <w:p>
+            <w:pPr>
+              <w:spacing w:after="160" w:line="278" w:lineRule="auto"/>
+            </w:pPr>
+            <w:hyperlink r:id="rId14" w:history="1">
               <w:r>
                 <w:rPr>
                   <w:rStyle w:val="Hyperlink"/>
@@ -1753,7 +1948,7 @@
       <w:tr>
         <w:tc>
           <w:tcPr>
-            <w:tcW w:w="4405" w:type="dxa"/>
+            <w:tcW w:w="4112" w:type="dxa"/>
             <w:hideMark/>
           </w:tcPr>
           <w:p>
@@ -1777,14 +1972,14 @@
         </w:tc>
         <w:tc>
           <w:tcPr>
-            <w:tcW w:w="4945" w:type="dxa"/>
-            <w:hideMark/>
-          </w:tcPr>
-          <w:p>
-            <w:pPr>
-              <w:spacing w:after="160" w:line="278" w:lineRule="auto"/>
-            </w:pPr>
-            <w:hyperlink r:id="rId9" w:history="1">
+            <w:tcW w:w="5238" w:type="dxa"/>
+            <w:hideMark/>
+          </w:tcPr>
+          <w:p>
+            <w:pPr>
+              <w:spacing w:after="160" w:line="278" w:lineRule="auto"/>
+            </w:pPr>
+            <w:hyperlink r:id="rId15" w:history="1">
               <w:r>
                 <w:rPr>
                   <w:rStyle w:val="Hyperlink"/>
@@ -1798,7 +1993,7 @@
       <w:tr>
         <w:tc>
           <w:tcPr>
-            <w:tcW w:w="4405" w:type="dxa"/>
+            <w:tcW w:w="4112" w:type="dxa"/>
           </w:tcPr>
           <w:p>
             <w:proofErr w:type="spellStart"/>
@@ -1818,10 +2013,10 @@
         </w:tc>
         <w:tc>
           <w:tcPr>
-            <w:tcW w:w="4945" w:type="dxa"/>
-          </w:tcPr>
-          <w:p>
-            <w:hyperlink r:id="rId10" w:history="1">
+            <w:tcW w:w="5238" w:type="dxa"/>
+          </w:tcPr>
+          <w:p>
+            <w:hyperlink r:id="rId16" w:history="1">
               <w:r>
                 <w:rPr>
                   <w:rStyle w:val="Hyperlink"/>
@@ -1835,7 +2030,7 @@
       <w:tr>
         <w:tc>
           <w:tcPr>
-            <w:tcW w:w="4405" w:type="dxa"/>
+            <w:tcW w:w="4112" w:type="dxa"/>
             <w:hideMark/>
           </w:tcPr>
           <w:p>
@@ -1854,14 +2049,14 @@
         </w:tc>
         <w:tc>
           <w:tcPr>
-            <w:tcW w:w="4945" w:type="dxa"/>
-            <w:hideMark/>
-          </w:tcPr>
-          <w:p>
-            <w:pPr>
-              <w:spacing w:after="160" w:line="278" w:lineRule="auto"/>
-            </w:pPr>
-            <w:hyperlink r:id="rId11" w:history="1">
+            <w:tcW w:w="5238" w:type="dxa"/>
+            <w:hideMark/>
+          </w:tcPr>
+          <w:p>
+            <w:pPr>
+              <w:spacing w:after="160" w:line="278" w:lineRule="auto"/>
+            </w:pPr>
+            <w:hyperlink r:id="rId17" w:history="1">
               <w:r>
                 <w:rPr>
                   <w:rStyle w:val="Hyperlink"/>
@@ -1875,7 +2070,7 @@
       <w:tr>
         <w:tc>
           <w:tcPr>
-            <w:tcW w:w="4405" w:type="dxa"/>
+            <w:tcW w:w="4112" w:type="dxa"/>
             <w:hideMark/>
           </w:tcPr>
           <w:p>
@@ -1894,14 +2089,14 @@
         </w:tc>
         <w:tc>
           <w:tcPr>
-            <w:tcW w:w="4945" w:type="dxa"/>
-            <w:hideMark/>
-          </w:tcPr>
-          <w:p>
-            <w:pPr>
-              <w:spacing w:after="160" w:line="278" w:lineRule="auto"/>
-            </w:pPr>
-            <w:hyperlink r:id="rId12" w:history="1">
+            <w:tcW w:w="5238" w:type="dxa"/>
+            <w:hideMark/>
+          </w:tcPr>
+          <w:p>
+            <w:pPr>
+              <w:spacing w:after="160" w:line="278" w:lineRule="auto"/>
+            </w:pPr>
+            <w:hyperlink r:id="rId18" w:history="1">
               <w:r>
                 <w:rPr>
                   <w:rStyle w:val="Hyperlink"/>
@@ -1915,7 +2110,7 @@
       <w:tr>
         <w:tc>
           <w:tcPr>
-            <w:tcW w:w="4405" w:type="dxa"/>
+            <w:tcW w:w="4112" w:type="dxa"/>
             <w:hideMark/>
           </w:tcPr>
           <w:p>
@@ -1939,14 +2134,14 @@
         </w:tc>
         <w:tc>
           <w:tcPr>
-            <w:tcW w:w="4945" w:type="dxa"/>
-            <w:hideMark/>
-          </w:tcPr>
-          <w:p>
-            <w:pPr>
-              <w:spacing w:after="160" w:line="278" w:lineRule="auto"/>
-            </w:pPr>
-            <w:hyperlink r:id="rId13" w:history="1">
+            <w:tcW w:w="5238" w:type="dxa"/>
+            <w:hideMark/>
+          </w:tcPr>
+          <w:p>
+            <w:pPr>
+              <w:spacing w:after="160" w:line="278" w:lineRule="auto"/>
+            </w:pPr>
+            <w:hyperlink r:id="rId19" w:history="1">
               <w:r>
                 <w:rPr>
                   <w:rStyle w:val="Hyperlink"/>
@@ -1960,7 +2155,7 @@
       <w:tr>
         <w:tc>
           <w:tcPr>
-            <w:tcW w:w="4405" w:type="dxa"/>
+            <w:tcW w:w="4112" w:type="dxa"/>
           </w:tcPr>
           <w:p>
             <w:proofErr w:type="spellStart"/>
@@ -1978,10 +2173,10 @@
         </w:tc>
         <w:tc>
           <w:tcPr>
-            <w:tcW w:w="4945" w:type="dxa"/>
-          </w:tcPr>
-          <w:p>
-            <w:hyperlink r:id="rId14" w:history="1">
+            <w:tcW w:w="5238" w:type="dxa"/>
+          </w:tcPr>
+          <w:p>
+            <w:hyperlink r:id="rId20" w:history="1">
               <w:r>
                 <w:rPr>
                   <w:rStyle w:val="Hyperlink"/>
@@ -1995,7 +2190,7 @@
       <w:tr>
         <w:tc>
           <w:tcPr>
-            <w:tcW w:w="4405" w:type="dxa"/>
+            <w:tcW w:w="4112" w:type="dxa"/>
             <w:hideMark/>
           </w:tcPr>
           <w:p>
@@ -2014,14 +2209,14 @@
         </w:tc>
         <w:tc>
           <w:tcPr>
-            <w:tcW w:w="4945" w:type="dxa"/>
-            <w:hideMark/>
-          </w:tcPr>
-          <w:p>
-            <w:pPr>
-              <w:spacing w:after="160" w:line="278" w:lineRule="auto"/>
-            </w:pPr>
-            <w:hyperlink r:id="rId15" w:history="1">
+            <w:tcW w:w="5238" w:type="dxa"/>
+            <w:hideMark/>
+          </w:tcPr>
+          <w:p>
+            <w:pPr>
+              <w:spacing w:after="160" w:line="278" w:lineRule="auto"/>
+            </w:pPr>
+            <w:hyperlink r:id="rId21" w:history="1">
               <w:r>
                 <w:rPr>
                   <w:rStyle w:val="Hyperlink"/>
@@ -2035,16 +2230,15 @@
       <w:tr>
         <w:tc>
           <w:tcPr>
-            <w:tcW w:w="4405" w:type="dxa"/>
-            <w:hideMark/>
-          </w:tcPr>
-          <w:p>
-            <w:pPr>
-              <w:spacing w:after="160" w:line="278" w:lineRule="auto"/>
-            </w:pPr>
-            <w:proofErr w:type="spellStart"/>
-            <w:r>
-              <w:lastRenderedPageBreak/>
+            <w:tcW w:w="4112" w:type="dxa"/>
+            <w:hideMark/>
+          </w:tcPr>
+          <w:p>
+            <w:pPr>
+              <w:spacing w:after="160" w:line="278" w:lineRule="auto"/>
+            </w:pPr>
+            <w:proofErr w:type="spellStart"/>
+            <w:r>
               <w:t>PricePanel</w:t>
             </w:r>
             <w:proofErr w:type="spellEnd"/>
@@ -2063,25 +2257,19 @@
         </w:tc>
         <w:tc>
           <w:tcPr>
-            <w:tcW w:w="4945" w:type="dxa"/>
-            <w:hideMark/>
-          </w:tcPr>
-          <w:p>
-            <w:pPr>
-              <w:spacing w:after="160" w:line="278" w:lineRule="auto"/>
-            </w:pPr>
-            <w:hyperlink r:id="rId16" w:history="1">
+            <w:tcW w:w="5238" w:type="dxa"/>
+            <w:hideMark/>
+          </w:tcPr>
+          <w:p>
+            <w:pPr>
+              <w:spacing w:after="160" w:line="278" w:lineRule="auto"/>
+            </w:pPr>
+            <w:hyperlink r:id="rId22" w:history="1">
               <w:r>
                 <w:rPr>
                   <w:rStyle w:val="Hyperlink"/>
                 </w:rPr>
-                <w:t>PricePanel_VaryByCookie_Cached.</w:t>
-              </w:r>
-              <w:r>
-                <w:rPr>
-                  <w:rStyle w:val="Hyperlink"/>
-                </w:rPr>
-                <w:t>mp4</w:t>
+                <w:t>PricePanel_VaryByCookie_Cached.mp4</w:t>
               </w:r>
             </w:hyperlink>
           </w:p>
@@ -2090,7 +2278,7 @@
       <w:tr>
         <w:tc>
           <w:tcPr>
-            <w:tcW w:w="4405" w:type="dxa"/>
+            <w:tcW w:w="4112" w:type="dxa"/>
             <w:hideMark/>
           </w:tcPr>
           <w:p>
@@ -2112,14 +2300,14 @@
         </w:tc>
         <w:tc>
           <w:tcPr>
-            <w:tcW w:w="4945" w:type="dxa"/>
-            <w:hideMark/>
-          </w:tcPr>
-          <w:p>
-            <w:pPr>
-              <w:spacing w:after="160" w:line="278" w:lineRule="auto"/>
-            </w:pPr>
-            <w:hyperlink r:id="rId17" w:history="1">
+            <w:tcW w:w="5238" w:type="dxa"/>
+            <w:hideMark/>
+          </w:tcPr>
+          <w:p>
+            <w:pPr>
+              <w:spacing w:after="160" w:line="278" w:lineRule="auto"/>
+            </w:pPr>
+            <w:hyperlink r:id="rId23" w:history="1">
               <w:r>
                 <w:rPr>
                   <w:rStyle w:val="Hyperlink"/>
@@ -2131,7 +2319,1369 @@
         </w:tc>
       </w:tr>
     </w:tbl>
-    <w:p/>
+    <w:p>
+      <w:pPr>
+        <w:rPr>
+          <w:b/>
+          <w:bCs/>
+          <w:sz w:val="32"/>
+          <w:szCs w:val="32"/>
+        </w:rPr>
+      </w:pPr>
+    </w:p>
+    <w:p>
+      <w:pPr>
+        <w:rPr>
+          <w:b/>
+          <w:bCs/>
+          <w:sz w:val="32"/>
+          <w:szCs w:val="32"/>
+        </w:rPr>
+      </w:pPr>
+      <w:r>
+        <w:rPr>
+          <w:b/>
+          <w:bCs/>
+          <w:sz w:val="32"/>
+          <w:szCs w:val="32"/>
+        </w:rPr>
+        <w:t xml:space="preserve">Exception </w:t>
+      </w:r>
+      <w:r>
+        <w:rPr>
+          <w:b/>
+          <w:bCs/>
+          <w:sz w:val="32"/>
+          <w:szCs w:val="32"/>
+        </w:rPr>
+        <w:t>Message</w:t>
+      </w:r>
+      <w:r>
+        <w:rPr>
+          <w:b/>
+          <w:bCs/>
+          <w:sz w:val="32"/>
+          <w:szCs w:val="32"/>
+        </w:rPr>
+        <w:t xml:space="preserve"> and its</w:t>
+      </w:r>
+      <w:r>
+        <w:rPr>
+          <w:b/>
+          <w:bCs/>
+          <w:sz w:val="32"/>
+          <w:szCs w:val="32"/>
+        </w:rPr>
+        <w:t xml:space="preserve"> Usability Assessment</w:t>
+      </w:r>
+    </w:p>
+    <w:tbl>
+      <w:tblPr>
+        <w:tblStyle w:val="TableGrid"/>
+        <w:tblW w:w="0" w:type="auto"/>
+        <w:tblLayout w:type="fixed"/>
+        <w:tblLook w:val="04A0" w:firstRow="1" w:lastRow="0" w:firstColumn="1" w:lastColumn="0" w:noHBand="0" w:noVBand="1"/>
+      </w:tblPr>
+      <w:tblGrid>
+        <w:gridCol w:w="1885"/>
+        <w:gridCol w:w="2970"/>
+        <w:gridCol w:w="4495"/>
+      </w:tblGrid>
+      <w:tr>
+        <w:tc>
+          <w:tcPr>
+            <w:tcW w:w="1885" w:type="dxa"/>
+          </w:tcPr>
+          <w:p>
+            <w:pPr>
+              <w:jc w:val="center"/>
+              <w:rPr>
+                <w:b/>
+                <w:bCs/>
+                <w:sz w:val="28"/>
+                <w:szCs w:val="28"/>
+              </w:rPr>
+            </w:pPr>
+            <w:r>
+              <w:rPr>
+                <w:b/>
+                <w:bCs/>
+                <w:sz w:val="28"/>
+                <w:szCs w:val="28"/>
+              </w:rPr>
+              <w:t>Component</w:t>
+            </w:r>
+          </w:p>
+        </w:tc>
+        <w:tc>
+          <w:tcPr>
+            <w:tcW w:w="2970" w:type="dxa"/>
+          </w:tcPr>
+          <w:p>
+            <w:pPr>
+              <w:jc w:val="center"/>
+              <w:rPr>
+                <w:b/>
+                <w:bCs/>
+                <w:sz w:val="28"/>
+                <w:szCs w:val="28"/>
+              </w:rPr>
+            </w:pPr>
+            <w:r>
+              <w:rPr>
+                <w:b/>
+                <w:bCs/>
+                <w:sz w:val="28"/>
+                <w:szCs w:val="28"/>
+              </w:rPr>
+              <w:t>Assessment</w:t>
+            </w:r>
+          </w:p>
+        </w:tc>
+        <w:tc>
+          <w:tcPr>
+            <w:tcW w:w="4495" w:type="dxa"/>
+          </w:tcPr>
+          <w:p>
+            <w:pPr>
+              <w:jc w:val="center"/>
+              <w:rPr>
+                <w:b/>
+                <w:bCs/>
+                <w:sz w:val="32"/>
+                <w:szCs w:val="32"/>
+              </w:rPr>
+            </w:pPr>
+            <w:r>
+              <w:rPr>
+                <w:b/>
+                <w:bCs/>
+              </w:rPr>
+              <w:t>Exception</w:t>
+            </w:r>
+          </w:p>
+        </w:tc>
+      </w:tr>
+      <w:tr>
+        <w:tc>
+          <w:tcPr>
+            <w:tcW w:w="1885" w:type="dxa"/>
+          </w:tcPr>
+          <w:p>
+            <w:pPr>
+              <w:spacing w:after="160" w:line="278" w:lineRule="auto"/>
+              <w:rPr>
+                <w:b/>
+                <w:bCs/>
+              </w:rPr>
+            </w:pPr>
+            <w:proofErr w:type="spellStart"/>
+            <w:r>
+              <w:rPr>
+                <w:b/>
+                <w:bCs/>
+              </w:rPr>
+              <w:t>AuthorizeView</w:t>
+            </w:r>
+            <w:proofErr w:type="spellEnd"/>
+          </w:p>
+        </w:tc>
+        <w:tc>
+          <w:tcPr>
+            <w:tcW w:w="2970" w:type="dxa"/>
+          </w:tcPr>
+          <w:p>
+            <w:r>
+              <w:t xml:space="preserve">The exception clearly identified </w:t>
+            </w:r>
+            <w:proofErr w:type="spellStart"/>
+            <w:r>
+              <w:t>AuthorizeView</w:t>
+            </w:r>
+            <w:proofErr w:type="spellEnd"/>
+            <w:r>
+              <w:t xml:space="preserve"> and instructed the developer to configure </w:t>
+            </w:r>
+            <w:proofErr w:type="spellStart"/>
+            <w:r>
+              <w:t>VaryByUser</w:t>
+            </w:r>
+            <w:proofErr w:type="spellEnd"/>
+            <w:r>
+              <w:t xml:space="preserve"> or move the component outside the </w:t>
+            </w:r>
+            <w:proofErr w:type="spellStart"/>
+            <w:r>
+              <w:t>CacheView</w:t>
+            </w:r>
+            <w:proofErr w:type="spellEnd"/>
+            <w:r>
+              <w:t>. No source-</w:t>
+            </w:r>
+            <w:r>
+              <w:lastRenderedPageBreak/>
+              <w:t>code inspection was required.</w:t>
+            </w:r>
+          </w:p>
+          <w:p>
+            <w:pPr>
+              <w:rPr>
+                <w:b/>
+                <w:bCs/>
+                <w:sz w:val="32"/>
+                <w:szCs w:val="32"/>
+              </w:rPr>
+            </w:pPr>
+          </w:p>
+        </w:tc>
+        <w:tc>
+          <w:tcPr>
+            <w:tcW w:w="4495" w:type="dxa"/>
+          </w:tcPr>
+          <w:p>
+            <w:pPr>
+              <w:spacing w:after="160" w:line="278" w:lineRule="auto"/>
+              <w:rPr>
+                <w:i/>
+                <w:iCs/>
+              </w:rPr>
+            </w:pPr>
+            <w:proofErr w:type="spellStart"/>
+            <w:r>
+              <w:rPr>
+                <w:i/>
+                <w:iCs/>
+              </w:rPr>
+              <w:lastRenderedPageBreak/>
+              <w:t>InvalidOperationException</w:t>
+            </w:r>
+            <w:proofErr w:type="spellEnd"/>
+            <w:r>
+              <w:rPr>
+                <w:i/>
+                <w:iCs/>
+              </w:rPr>
+              <w:t>: Component '</w:t>
+            </w:r>
+            <w:proofErr w:type="spellStart"/>
+            <w:proofErr w:type="gramStart"/>
+            <w:r>
+              <w:rPr>
+                <w:i/>
+                <w:iCs/>
+              </w:rPr>
+              <w:t>Microsoft.AspNetCore.Components.Authorization</w:t>
+            </w:r>
+            <w:proofErr w:type="gramEnd"/>
+            <w:r>
+              <w:rPr>
+                <w:i/>
+                <w:iCs/>
+              </w:rPr>
+              <w:t>.AuthorizeView</w:t>
+            </w:r>
+            <w:proofErr w:type="spellEnd"/>
+            <w:r>
+              <w:rPr>
+                <w:i/>
+                <w:iCs/>
+              </w:rPr>
+              <w:t xml:space="preserve">' cannot be used inside a </w:t>
+            </w:r>
+            <w:proofErr w:type="spellStart"/>
+            <w:r>
+              <w:rPr>
+                <w:i/>
+                <w:iCs/>
+              </w:rPr>
+              <w:t>CacheView</w:t>
+            </w:r>
+            <w:proofErr w:type="spellEnd"/>
+            <w:r>
+              <w:rPr>
+                <w:i/>
+                <w:iCs/>
+              </w:rPr>
+              <w:t xml:space="preserve"> because its output depends on per-request state ([</w:t>
+            </w:r>
+            <w:proofErr w:type="spellStart"/>
+            <w:proofErr w:type="gramStart"/>
+            <w:r>
+              <w:rPr>
+                <w:i/>
+                <w:iCs/>
+              </w:rPr>
+              <w:t>CacheBehavior</w:t>
+            </w:r>
+            <w:proofErr w:type="spellEnd"/>
+            <w:r>
+              <w:rPr>
+                <w:i/>
+                <w:iCs/>
+              </w:rPr>
+              <w:t>(</w:t>
+            </w:r>
+            <w:proofErr w:type="spellStart"/>
+            <w:proofErr w:type="gramEnd"/>
+            <w:r>
+              <w:rPr>
+                <w:i/>
+                <w:iCs/>
+              </w:rPr>
+              <w:t>CacheBehavior.Throw</w:t>
+            </w:r>
+            <w:proofErr w:type="spellEnd"/>
+            <w:r>
+              <w:rPr>
+                <w:i/>
+                <w:iCs/>
+              </w:rPr>
+              <w:t xml:space="preserve">)], </w:t>
+            </w:r>
+            <w:r>
+              <w:rPr>
+                <w:i/>
+                <w:iCs/>
+              </w:rPr>
+              <w:lastRenderedPageBreak/>
+              <w:t>[</w:t>
+            </w:r>
+            <w:proofErr w:type="spellStart"/>
+            <w:proofErr w:type="gramStart"/>
+            <w:r>
+              <w:rPr>
+                <w:i/>
+                <w:iCs/>
+              </w:rPr>
+              <w:t>CacheCondition</w:t>
+            </w:r>
+            <w:proofErr w:type="spellEnd"/>
+            <w:r>
+              <w:rPr>
+                <w:i/>
+                <w:iCs/>
+              </w:rPr>
+              <w:t>(</w:t>
+            </w:r>
+            <w:proofErr w:type="spellStart"/>
+            <w:proofErr w:type="gramEnd"/>
+            <w:r>
+              <w:rPr>
+                <w:i/>
+                <w:iCs/>
+              </w:rPr>
+              <w:t>CacheVaryBy.</w:t>
+            </w:r>
+            <w:proofErr w:type="gramStart"/>
+            <w:r>
+              <w:rPr>
+                <w:i/>
+                <w:iCs/>
+              </w:rPr>
+              <w:t>User</w:t>
+            </w:r>
+            <w:proofErr w:type="spellEnd"/>
+            <w:r>
+              <w:rPr>
+                <w:i/>
+                <w:iCs/>
+              </w:rPr>
+              <w:t>)]</w:t>
+            </w:r>
+            <w:proofErr w:type="gramEnd"/>
+            <w:r>
+              <w:rPr>
+                <w:i/>
+                <w:iCs/>
+              </w:rPr>
+              <w:t xml:space="preserve">) that cannot be safely cached and replayed. To fix this, configure the </w:t>
+            </w:r>
+            <w:proofErr w:type="spellStart"/>
+            <w:r>
+              <w:rPr>
+                <w:i/>
+                <w:iCs/>
+              </w:rPr>
+              <w:t>CacheView</w:t>
+            </w:r>
+            <w:proofErr w:type="spellEnd"/>
+            <w:r>
+              <w:rPr>
+                <w:i/>
+                <w:iCs/>
+              </w:rPr>
+              <w:t xml:space="preserve"> to vary by User, or move the component outside the </w:t>
+            </w:r>
+            <w:proofErr w:type="spellStart"/>
+            <w:r>
+              <w:rPr>
+                <w:i/>
+                <w:iCs/>
+              </w:rPr>
+              <w:t>CacheView</w:t>
+            </w:r>
+            <w:proofErr w:type="spellEnd"/>
+            <w:r>
+              <w:rPr>
+                <w:i/>
+                <w:iCs/>
+              </w:rPr>
+              <w:t>.</w:t>
+            </w:r>
+          </w:p>
+        </w:tc>
+      </w:tr>
+      <w:tr>
+        <w:tc>
+          <w:tcPr>
+            <w:tcW w:w="1885" w:type="dxa"/>
+          </w:tcPr>
+          <w:p>
+            <w:pPr>
+              <w:spacing w:after="160" w:line="278" w:lineRule="auto"/>
+              <w:rPr>
+                <w:b/>
+                <w:bCs/>
+              </w:rPr>
+            </w:pPr>
+            <w:proofErr w:type="spellStart"/>
+            <w:r>
+              <w:rPr>
+                <w:b/>
+                <w:bCs/>
+              </w:rPr>
+              <w:lastRenderedPageBreak/>
+              <w:t>QuickGrid</w:t>
+            </w:r>
+            <w:proofErr w:type="spellEnd"/>
+          </w:p>
+        </w:tc>
+        <w:tc>
+          <w:tcPr>
+            <w:tcW w:w="2970" w:type="dxa"/>
+          </w:tcPr>
+          <w:p>
+            <w:r>
+              <w:t xml:space="preserve">The exception clearly identified </w:t>
+            </w:r>
+            <w:proofErr w:type="spellStart"/>
+            <w:r>
+              <w:t>QuickGrid</w:t>
+            </w:r>
+            <w:proofErr w:type="spellEnd"/>
+            <w:r>
+              <w:t xml:space="preserve"> and instructed the developer to configure </w:t>
+            </w:r>
+            <w:proofErr w:type="spellStart"/>
+            <w:r>
+              <w:t>VaryByQuery</w:t>
+            </w:r>
+            <w:proofErr w:type="spellEnd"/>
+            <w:r>
+              <w:t xml:space="preserve"> or move the component outside the </w:t>
+            </w:r>
+            <w:proofErr w:type="spellStart"/>
+            <w:r>
+              <w:t>CacheView</w:t>
+            </w:r>
+            <w:proofErr w:type="spellEnd"/>
+            <w:r>
+              <w:t>. No source-code inspection was required.</w:t>
+            </w:r>
+          </w:p>
+        </w:tc>
+        <w:tc>
+          <w:tcPr>
+            <w:tcW w:w="4495" w:type="dxa"/>
+          </w:tcPr>
+          <w:p>
+            <w:pPr>
+              <w:rPr>
+                <w:i/>
+                <w:iCs/>
+              </w:rPr>
+            </w:pPr>
+            <w:proofErr w:type="spellStart"/>
+            <w:r>
+              <w:rPr>
+                <w:i/>
+                <w:iCs/>
+              </w:rPr>
+              <w:t>InvalidOperationException</w:t>
+            </w:r>
+            <w:proofErr w:type="spellEnd"/>
+            <w:r>
+              <w:rPr>
+                <w:i/>
+                <w:iCs/>
+              </w:rPr>
+              <w:t>: Component '</w:t>
+            </w:r>
+            <w:proofErr w:type="gramStart"/>
+            <w:r>
+              <w:rPr>
+                <w:i/>
+                <w:iCs/>
+              </w:rPr>
+              <w:t>Microsoft.AspNetCore.Components.QuickGrid</w:t>
+            </w:r>
+            <w:proofErr w:type="gramEnd"/>
+            <w:r>
+              <w:rPr>
+                <w:i/>
+                <w:iCs/>
+              </w:rPr>
+              <w:t>.QuickGrid`1[[</w:t>
+            </w:r>
+            <w:proofErr w:type="gramStart"/>
+            <w:r>
+              <w:rPr>
+                <w:i/>
+                <w:iCs/>
+              </w:rPr>
+              <w:t>CacheViewValidationSSR.Components.Pages.QuickGridRefusal</w:t>
+            </w:r>
+            <w:proofErr w:type="gramEnd"/>
+            <w:r>
+              <w:rPr>
+                <w:i/>
+                <w:iCs/>
+              </w:rPr>
+              <w:t xml:space="preserve">+Product, </w:t>
+            </w:r>
+            <w:proofErr w:type="spellStart"/>
+            <w:r>
+              <w:rPr>
+                <w:i/>
+                <w:iCs/>
+              </w:rPr>
+              <w:t>CacheViewValidationSSR</w:t>
+            </w:r>
+            <w:proofErr w:type="spellEnd"/>
+            <w:r>
+              <w:rPr>
+                <w:i/>
+                <w:iCs/>
+              </w:rPr>
+              <w:t xml:space="preserve">, Version=1.0.0.0, Culture=neutral, </w:t>
+            </w:r>
+            <w:proofErr w:type="spellStart"/>
+            <w:r>
+              <w:rPr>
+                <w:i/>
+                <w:iCs/>
+              </w:rPr>
+              <w:t>PublicKeyToken</w:t>
+            </w:r>
+            <w:proofErr w:type="spellEnd"/>
+            <w:r>
+              <w:rPr>
+                <w:i/>
+                <w:iCs/>
+              </w:rPr>
+              <w:t xml:space="preserve">=null]]' cannot be used inside a </w:t>
+            </w:r>
+            <w:proofErr w:type="spellStart"/>
+            <w:r>
+              <w:rPr>
+                <w:i/>
+                <w:iCs/>
+              </w:rPr>
+              <w:t>CacheView</w:t>
+            </w:r>
+            <w:proofErr w:type="spellEnd"/>
+            <w:r>
+              <w:rPr>
+                <w:i/>
+                <w:iCs/>
+              </w:rPr>
+              <w:t xml:space="preserve"> because its output depends on per-request state ([</w:t>
+            </w:r>
+            <w:proofErr w:type="spellStart"/>
+            <w:proofErr w:type="gramStart"/>
+            <w:r>
+              <w:rPr>
+                <w:i/>
+                <w:iCs/>
+              </w:rPr>
+              <w:t>CacheBehavior</w:t>
+            </w:r>
+            <w:proofErr w:type="spellEnd"/>
+            <w:r>
+              <w:rPr>
+                <w:i/>
+                <w:iCs/>
+              </w:rPr>
+              <w:t>(</w:t>
+            </w:r>
+            <w:proofErr w:type="spellStart"/>
+            <w:proofErr w:type="gramEnd"/>
+            <w:r>
+              <w:rPr>
+                <w:i/>
+                <w:iCs/>
+              </w:rPr>
+              <w:t>CacheBehavior.Throw</w:t>
+            </w:r>
+            <w:proofErr w:type="spellEnd"/>
+            <w:r>
+              <w:rPr>
+                <w:i/>
+                <w:iCs/>
+              </w:rPr>
+              <w:t>)], [</w:t>
+            </w:r>
+            <w:proofErr w:type="spellStart"/>
+            <w:proofErr w:type="gramStart"/>
+            <w:r>
+              <w:rPr>
+                <w:i/>
+                <w:iCs/>
+              </w:rPr>
+              <w:t>CacheCondition</w:t>
+            </w:r>
+            <w:proofErr w:type="spellEnd"/>
+            <w:r>
+              <w:rPr>
+                <w:i/>
+                <w:iCs/>
+              </w:rPr>
+              <w:t>(</w:t>
+            </w:r>
+            <w:proofErr w:type="spellStart"/>
+            <w:proofErr w:type="gramEnd"/>
+            <w:r>
+              <w:rPr>
+                <w:i/>
+                <w:iCs/>
+              </w:rPr>
+              <w:t>CacheVaryBy.Query</w:t>
+            </w:r>
+            <w:proofErr w:type="spellEnd"/>
+            <w:r>
+              <w:rPr>
+                <w:i/>
+                <w:iCs/>
+              </w:rPr>
+              <w:t xml:space="preserve">)]) that cannot be safely cached and replayed. To fix this, configure the </w:t>
+            </w:r>
+            <w:proofErr w:type="spellStart"/>
+            <w:r>
+              <w:rPr>
+                <w:i/>
+                <w:iCs/>
+              </w:rPr>
+              <w:t>CacheView</w:t>
+            </w:r>
+            <w:proofErr w:type="spellEnd"/>
+            <w:r>
+              <w:rPr>
+                <w:i/>
+                <w:iCs/>
+              </w:rPr>
+              <w:t xml:space="preserve"> to vary by Query, or move the component outside the </w:t>
+            </w:r>
+            <w:proofErr w:type="spellStart"/>
+            <w:r>
+              <w:rPr>
+                <w:i/>
+                <w:iCs/>
+              </w:rPr>
+              <w:t>CacheView</w:t>
+            </w:r>
+            <w:proofErr w:type="spellEnd"/>
+            <w:r>
+              <w:rPr>
+                <w:i/>
+                <w:iCs/>
+              </w:rPr>
+              <w:t>.</w:t>
+            </w:r>
+          </w:p>
+        </w:tc>
+      </w:tr>
+      <w:tr>
+        <w:tc>
+          <w:tcPr>
+            <w:tcW w:w="1885" w:type="dxa"/>
+          </w:tcPr>
+          <w:p>
+            <w:pPr>
+              <w:rPr>
+                <w:b/>
+                <w:bCs/>
+                <w:sz w:val="32"/>
+                <w:szCs w:val="32"/>
+              </w:rPr>
+            </w:pPr>
+            <w:proofErr w:type="spellStart"/>
+            <w:r>
+              <w:rPr>
+                <w:b/>
+                <w:bCs/>
+              </w:rPr>
+              <w:t>UserBadge</w:t>
+            </w:r>
+            <w:proofErr w:type="spellEnd"/>
+          </w:p>
+        </w:tc>
+        <w:tc>
+          <w:tcPr>
+            <w:tcW w:w="2970" w:type="dxa"/>
+          </w:tcPr>
+          <w:p>
+            <w:r>
+              <w:t xml:space="preserve">The exception clearly identified </w:t>
+            </w:r>
+            <w:proofErr w:type="spellStart"/>
+            <w:r>
+              <w:t>UserBadge</w:t>
+            </w:r>
+            <w:proofErr w:type="spellEnd"/>
+            <w:r>
+              <w:t xml:space="preserve"> and instructed the developer to move the component outside the </w:t>
+            </w:r>
+            <w:proofErr w:type="spellStart"/>
+            <w:r>
+              <w:t>CacheView</w:t>
+            </w:r>
+            <w:proofErr w:type="spellEnd"/>
+            <w:r>
+              <w:t xml:space="preserve">. Since the component declared </w:t>
+            </w:r>
+            <w:proofErr w:type="spellStart"/>
+            <w:r>
+              <w:t>CacheBehavior.Throw</w:t>
+            </w:r>
+            <w:proofErr w:type="spellEnd"/>
+            <w:r>
+              <w:t>, the message provided sufficient guidance without source inspection.</w:t>
+            </w:r>
+          </w:p>
+        </w:tc>
+        <w:tc>
+          <w:tcPr>
+            <w:tcW w:w="4495" w:type="dxa"/>
+          </w:tcPr>
+          <w:p>
+            <w:pPr>
+              <w:rPr>
+                <w:i/>
+                <w:iCs/>
+              </w:rPr>
+            </w:pPr>
+            <w:proofErr w:type="spellStart"/>
+            <w:r>
+              <w:rPr>
+                <w:i/>
+                <w:iCs/>
+              </w:rPr>
+              <w:t>InvalidOperationException</w:t>
+            </w:r>
+            <w:proofErr w:type="spellEnd"/>
+            <w:r>
+              <w:rPr>
+                <w:i/>
+                <w:iCs/>
+              </w:rPr>
+              <w:t>: Component '</w:t>
+            </w:r>
+            <w:proofErr w:type="spellStart"/>
+            <w:proofErr w:type="gramStart"/>
+            <w:r>
+              <w:rPr>
+                <w:i/>
+                <w:iCs/>
+              </w:rPr>
+              <w:t>CacheViewValidationComponents.Components.UserBadge</w:t>
+            </w:r>
+            <w:proofErr w:type="spellEnd"/>
+            <w:proofErr w:type="gramEnd"/>
+            <w:r>
+              <w:rPr>
+                <w:i/>
+                <w:iCs/>
+              </w:rPr>
+              <w:t xml:space="preserve">' cannot be used inside a </w:t>
+            </w:r>
+            <w:proofErr w:type="spellStart"/>
+            <w:r>
+              <w:rPr>
+                <w:i/>
+                <w:iCs/>
+              </w:rPr>
+              <w:t>CacheView</w:t>
+            </w:r>
+            <w:proofErr w:type="spellEnd"/>
+            <w:r>
+              <w:rPr>
+                <w:i/>
+                <w:iCs/>
+              </w:rPr>
+              <w:t xml:space="preserve"> because its output depends on per-request state ([</w:t>
+            </w:r>
+            <w:proofErr w:type="spellStart"/>
+            <w:proofErr w:type="gramStart"/>
+            <w:r>
+              <w:rPr>
+                <w:i/>
+                <w:iCs/>
+              </w:rPr>
+              <w:t>CacheBehavior</w:t>
+            </w:r>
+            <w:proofErr w:type="spellEnd"/>
+            <w:r>
+              <w:rPr>
+                <w:i/>
+                <w:iCs/>
+              </w:rPr>
+              <w:t>(</w:t>
+            </w:r>
+            <w:proofErr w:type="spellStart"/>
+            <w:proofErr w:type="gramEnd"/>
+            <w:r>
+              <w:rPr>
+                <w:i/>
+                <w:iCs/>
+              </w:rPr>
+              <w:t>CacheBehavior.Throw</w:t>
+            </w:r>
+            <w:proofErr w:type="spellEnd"/>
+            <w:r>
+              <w:rPr>
+                <w:i/>
+                <w:iCs/>
+              </w:rPr>
+              <w:t xml:space="preserve">)]) that cannot be safely </w:t>
+            </w:r>
+            <w:proofErr w:type="gramStart"/>
+            <w:r>
+              <w:rPr>
+                <w:i/>
+                <w:iCs/>
+              </w:rPr>
+              <w:t>cached</w:t>
+            </w:r>
+            <w:proofErr w:type="gramEnd"/>
+            <w:r>
+              <w:rPr>
+                <w:i/>
+                <w:iCs/>
+              </w:rPr>
+              <w:t xml:space="preserve"> and replayed. To fix this, move the component outside the </w:t>
+            </w:r>
+            <w:proofErr w:type="spellStart"/>
+            <w:r>
+              <w:rPr>
+                <w:i/>
+                <w:iCs/>
+              </w:rPr>
+              <w:t>CacheView</w:t>
+            </w:r>
+            <w:proofErr w:type="spellEnd"/>
+            <w:r>
+              <w:rPr>
+                <w:i/>
+                <w:iCs/>
+              </w:rPr>
+              <w:t>.</w:t>
+            </w:r>
+          </w:p>
+        </w:tc>
+      </w:tr>
+      <w:tr>
+        <w:tc>
+          <w:tcPr>
+            <w:tcW w:w="1885" w:type="dxa"/>
+          </w:tcPr>
+          <w:p>
+            <w:pPr>
+              <w:spacing w:after="160" w:line="278" w:lineRule="auto"/>
+              <w:rPr>
+                <w:b/>
+                <w:bCs/>
+              </w:rPr>
+            </w:pPr>
+            <w:r>
+              <w:rPr>
+                <w:b/>
+                <w:bCs/>
+              </w:rPr>
+              <w:t xml:space="preserve">Nested </w:t>
+            </w:r>
+            <w:proofErr w:type="spellStart"/>
+            <w:r>
+              <w:rPr>
+                <w:b/>
+                <w:bCs/>
+              </w:rPr>
+              <w:t>CacheView</w:t>
+            </w:r>
+            <w:proofErr w:type="spellEnd"/>
+          </w:p>
+        </w:tc>
+        <w:tc>
+          <w:tcPr>
+            <w:tcW w:w="2970" w:type="dxa"/>
+          </w:tcPr>
+          <w:p>
+            <w:r>
+              <w:t xml:space="preserve">The exception explicitly stated that </w:t>
+            </w:r>
+            <w:proofErr w:type="spellStart"/>
+            <w:r>
+              <w:t>CacheView</w:t>
+            </w:r>
+            <w:proofErr w:type="spellEnd"/>
+            <w:r>
+              <w:t xml:space="preserve"> cannot be nested and instructed the developer to move the inner </w:t>
+            </w:r>
+            <w:proofErr w:type="spellStart"/>
+            <w:r>
+              <w:t>CacheView</w:t>
+            </w:r>
+            <w:proofErr w:type="spellEnd"/>
+            <w:r>
+              <w:t>. No source-code inspection was required.</w:t>
+            </w:r>
+          </w:p>
+        </w:tc>
+        <w:tc>
+          <w:tcPr>
+            <w:tcW w:w="4495" w:type="dxa"/>
+          </w:tcPr>
+          <w:p>
+            <w:pPr>
+              <w:rPr>
+                <w:i/>
+                <w:iCs/>
+              </w:rPr>
+            </w:pPr>
+            <w:proofErr w:type="spellStart"/>
+            <w:r>
+              <w:rPr>
+                <w:i/>
+                <w:iCs/>
+              </w:rPr>
+              <w:t>InvalidOperationException</w:t>
+            </w:r>
+            <w:proofErr w:type="spellEnd"/>
+            <w:r>
+              <w:rPr>
+                <w:i/>
+                <w:iCs/>
+              </w:rPr>
+              <w:t xml:space="preserve">: A </w:t>
+            </w:r>
+            <w:proofErr w:type="spellStart"/>
+            <w:r>
+              <w:rPr>
+                <w:i/>
+                <w:iCs/>
+              </w:rPr>
+              <w:t>CacheView</w:t>
+            </w:r>
+            <w:proofErr w:type="spellEnd"/>
+            <w:r>
+              <w:rPr>
+                <w:i/>
+                <w:iCs/>
+              </w:rPr>
+              <w:t xml:space="preserve"> cannot be nested inside another </w:t>
+            </w:r>
+            <w:proofErr w:type="spellStart"/>
+            <w:r>
+              <w:rPr>
+                <w:i/>
+                <w:iCs/>
+              </w:rPr>
+              <w:t>CacheView</w:t>
+            </w:r>
+            <w:proofErr w:type="spellEnd"/>
+            <w:r>
+              <w:rPr>
+                <w:i/>
+                <w:iCs/>
+              </w:rPr>
+              <w:t xml:space="preserve">. The inner </w:t>
+            </w:r>
+            <w:proofErr w:type="spellStart"/>
+            <w:r>
+              <w:rPr>
+                <w:i/>
+                <w:iCs/>
+              </w:rPr>
+              <w:t>CacheView's</w:t>
+            </w:r>
+            <w:proofErr w:type="spellEnd"/>
+            <w:r>
+              <w:rPr>
+                <w:i/>
+                <w:iCs/>
+              </w:rPr>
+              <w:t xml:space="preserve"> output would be frozen into the outer cache entry and replayed on later requests, which is unsafe for per-request content such as </w:t>
+            </w:r>
+            <w:proofErr w:type="spellStart"/>
+            <w:r>
+              <w:rPr>
+                <w:i/>
+                <w:iCs/>
+              </w:rPr>
+              <w:t>antiforgery</w:t>
+            </w:r>
+            <w:proofErr w:type="spellEnd"/>
+            <w:r>
+              <w:rPr>
+                <w:i/>
+                <w:iCs/>
+              </w:rPr>
+              <w:t xml:space="preserve"> tokens, authentication-dependent output, or interactive component markers. Move the </w:t>
+            </w:r>
+            <w:proofErr w:type="spellStart"/>
+            <w:r>
+              <w:rPr>
+                <w:i/>
+                <w:iCs/>
+              </w:rPr>
+              <w:t>CacheView</w:t>
+            </w:r>
+            <w:proofErr w:type="spellEnd"/>
+            <w:r>
+              <w:rPr>
+                <w:i/>
+                <w:iCs/>
+              </w:rPr>
+              <w:t xml:space="preserve"> so it is not nested inside another one.</w:t>
+            </w:r>
+          </w:p>
+        </w:tc>
+      </w:tr>
+    </w:tbl>
+    <w:p>
+      <w:pPr>
+        <w:rPr>
+          <w:b/>
+          <w:bCs/>
+          <w:sz w:val="32"/>
+          <w:szCs w:val="32"/>
+        </w:rPr>
+      </w:pPr>
+      <w:r>
+        <w:rPr>
+          <w:b/>
+          <w:bCs/>
+          <w:sz w:val="32"/>
+          <w:szCs w:val="32"/>
+        </w:rPr>
+        <w:lastRenderedPageBreak/>
+        <w:t>Documentation Assessment</w:t>
+      </w:r>
+    </w:p>
+    <w:p>
+      <w:pPr>
+        <w:rPr>
+          <w:b/>
+          <w:bCs/>
+        </w:rPr>
+      </w:pPr>
+      <w:r>
+        <w:rPr>
+          <w:b/>
+          <w:bCs/>
+        </w:rPr>
+        <w:t>Reviewed Documentation:</w:t>
+      </w:r>
+    </w:p>
+    <w:p>
+      <w:r>
+        <w:t xml:space="preserve">- </w:t>
+      </w:r>
+      <w:hyperlink r:id="rId24" w:history="1">
+        <w:r>
+          <w:rPr>
+            <w:rStyle w:val="Hyperlink"/>
+          </w:rPr>
+          <w:t xml:space="preserve">ASP.NET Core Blazor </w:t>
+        </w:r>
+        <w:proofErr w:type="spellStart"/>
+        <w:r>
+          <w:rPr>
+            <w:rStyle w:val="Hyperlink"/>
+          </w:rPr>
+          <w:t>CacheView</w:t>
+        </w:r>
+        <w:proofErr w:type="spellEnd"/>
+        <w:r>
+          <w:rPr>
+            <w:rStyle w:val="Hyperlink"/>
+          </w:rPr>
+          <w:t xml:space="preserve"> component | Microsoft Learn</w:t>
+        </w:r>
+      </w:hyperlink>
+    </w:p>
+    <w:p>
+      <w:pPr>
+        <w:rPr>
+          <w:b/>
+          <w:bCs/>
+        </w:rPr>
+      </w:pPr>
+      <w:r>
+        <w:rPr>
+          <w:b/>
+          <w:bCs/>
+        </w:rPr>
+        <w:t>Observations:</w:t>
+      </w:r>
+    </w:p>
+    <w:p>
+      <w:pPr>
+        <w:pStyle w:val="ListParagraph"/>
+        <w:numPr>
+          <w:ilvl w:val="0"/>
+          <w:numId w:val="7"/>
+        </w:numPr>
+      </w:pPr>
+      <w:r>
+        <w:t xml:space="preserve">The documentation explains </w:t>
+      </w:r>
+      <w:proofErr w:type="spellStart"/>
+      <w:r>
+        <w:rPr>
+          <w:b/>
+        </w:rPr>
+        <w:t>CacheView</w:t>
+      </w:r>
+      <w:proofErr w:type="spellEnd"/>
+      <w:r>
+        <w:t xml:space="preserve"> concepts, cache boundaries, vary-by options, expiration settings, and limitations.</w:t>
+      </w:r>
+    </w:p>
+    <w:p>
+      <w:pPr>
+        <w:pStyle w:val="ListParagraph"/>
+        <w:numPr>
+          <w:ilvl w:val="0"/>
+          <w:numId w:val="7"/>
+        </w:numPr>
+      </w:pPr>
+      <w:r>
+        <w:t xml:space="preserve">It provides sufficient information to understand why </w:t>
+      </w:r>
+      <w:proofErr w:type="spellStart"/>
+      <w:r>
+        <w:rPr>
+          <w:b/>
+        </w:rPr>
+        <w:t>AuthorizeView</w:t>
+      </w:r>
+      <w:proofErr w:type="spellEnd"/>
+      <w:r>
+        <w:t xml:space="preserve"> requires </w:t>
+      </w:r>
+      <w:proofErr w:type="spellStart"/>
+      <w:r>
+        <w:rPr>
+          <w:b/>
+        </w:rPr>
+        <w:t>VaryByUser</w:t>
+      </w:r>
+      <w:proofErr w:type="spellEnd"/>
+      <w:r>
+        <w:t xml:space="preserve">, why </w:t>
+      </w:r>
+      <w:proofErr w:type="spellStart"/>
+      <w:r>
+        <w:rPr>
+          <w:b/>
+        </w:rPr>
+        <w:t>QuickGrid</w:t>
+      </w:r>
+      <w:proofErr w:type="spellEnd"/>
+      <w:r>
+        <w:t xml:space="preserve"> requires </w:t>
+      </w:r>
+      <w:proofErr w:type="spellStart"/>
+      <w:r>
+        <w:rPr>
+          <w:b/>
+        </w:rPr>
+        <w:t>VaryByQuery</w:t>
+      </w:r>
+      <w:proofErr w:type="spellEnd"/>
+      <w:r>
+        <w:t xml:space="preserve">, and why cookie-dependent output should use </w:t>
+      </w:r>
+      <w:proofErr w:type="spellStart"/>
+      <w:r>
+        <w:rPr>
+          <w:b/>
+        </w:rPr>
+        <w:t>VaryByCookie</w:t>
+      </w:r>
+      <w:proofErr w:type="spellEnd"/>
+      <w:r>
+        <w:t>.</w:t>
+      </w:r>
+    </w:p>
+    <w:p>
+      <w:pPr>
+        <w:pStyle w:val="ListParagraph"/>
+        <w:numPr>
+          <w:ilvl w:val="0"/>
+          <w:numId w:val="7"/>
+        </w:numPr>
+      </w:pPr>
+      <w:r>
+        <w:t xml:space="preserve">It provides basic examples of </w:t>
+      </w:r>
+      <w:proofErr w:type="spellStart"/>
+      <w:r>
+        <w:rPr>
+          <w:b/>
+        </w:rPr>
+        <w:t>CacheBehavior.Throw</w:t>
+      </w:r>
+      <w:proofErr w:type="spellEnd"/>
+      <w:r>
+        <w:t xml:space="preserve">, </w:t>
+      </w:r>
+      <w:proofErr w:type="spellStart"/>
+      <w:r>
+        <w:rPr>
+          <w:b/>
+        </w:rPr>
+        <w:t>CacheBehavior.Rerender</w:t>
+      </w:r>
+      <w:proofErr w:type="spellEnd"/>
+      <w:r>
+        <w:t xml:space="preserve">, and </w:t>
+      </w:r>
+      <w:proofErr w:type="spellStart"/>
+      <w:r>
+        <w:rPr>
+          <w:b/>
+        </w:rPr>
+        <w:t>CacheCondition</w:t>
+      </w:r>
+      <w:proofErr w:type="spellEnd"/>
+      <w:r>
+        <w:t>, including a user-based conditional safety example.</w:t>
+      </w:r>
+    </w:p>
+    <w:p>
+      <w:pPr>
+        <w:pStyle w:val="ListParagraph"/>
+        <w:numPr>
+          <w:ilvl w:val="0"/>
+          <w:numId w:val="7"/>
+        </w:numPr>
+      </w:pPr>
+      <w:r>
+        <w:t xml:space="preserve">However, it doesn't provide comprehensive guidance for third-party component authors, such as a behavior matrix explaining when to use unconditional refusal, conditional refusal, </w:t>
+      </w:r>
+      <w:proofErr w:type="spellStart"/>
+      <w:r>
+        <w:t>rerendering</w:t>
+      </w:r>
+      <w:proofErr w:type="spellEnd"/>
+      <w:r>
+        <w:t>, or conditional caching.</w:t>
+      </w:r>
+    </w:p>
+    <w:p>
+      <w:pPr>
+        <w:pStyle w:val="ListParagraph"/>
+        <w:numPr>
+          <w:ilvl w:val="0"/>
+          <w:numId w:val="7"/>
+        </w:numPr>
+      </w:pPr>
+      <w:r>
+        <w:t xml:space="preserve">It doesn't explicitly demonstrate scenarios equivalent to an unconditional </w:t>
+      </w:r>
+      <w:proofErr w:type="spellStart"/>
+      <w:r>
+        <w:rPr>
+          <w:b/>
+        </w:rPr>
+        <w:t>UserBadge</w:t>
+      </w:r>
+      <w:proofErr w:type="spellEnd"/>
+      <w:r>
+        <w:t xml:space="preserve"> refusal or a </w:t>
+      </w:r>
+      <w:proofErr w:type="spellStart"/>
+      <w:r>
+        <w:rPr>
+          <w:b/>
+        </w:rPr>
+        <w:t>PricePanel</w:t>
+      </w:r>
+      <w:proofErr w:type="spellEnd"/>
+      <w:r>
+        <w:t xml:space="preserve"> that </w:t>
+      </w:r>
+      <w:proofErr w:type="spellStart"/>
+      <w:r>
+        <w:t>rerenders</w:t>
+      </w:r>
+      <w:proofErr w:type="spellEnd"/>
+      <w:r>
+        <w:t xml:space="preserve"> unless a cookie vary-by condition is satisfied.</w:t>
+      </w:r>
+    </w:p>
+    <w:p>
+      <w:pPr>
+        <w:pStyle w:val="ListParagraph"/>
+        <w:numPr>
+          <w:ilvl w:val="0"/>
+          <w:numId w:val="7"/>
+        </w:numPr>
+      </w:pPr>
+      <w:r>
+        <w:t>It also doesn't show representative actionable exception messages or clearly document named conditions and how multiple conditions are evaluated.</w:t>
+      </w:r>
+    </w:p>
+    <w:p>
+      <w:r>
+        <w:rPr>
+          <w:b/>
+          <w:bCs/>
+        </w:rPr>
+        <w:t>Documentation Sufficiency Verdict:</w:t>
+      </w:r>
+      <w:r>
+        <w:t xml:space="preserve"> </w:t>
+      </w:r>
+      <w:r>
+        <w:t>Partially Sufficient</w:t>
+      </w:r>
+    </w:p>
+    <w:p>
+      <w:r>
+        <w:t xml:space="preserve">The documentation provides solid foundational </w:t>
+      </w:r>
+      <w:proofErr w:type="spellStart"/>
+      <w:r>
+        <w:rPr>
+          <w:b/>
+        </w:rPr>
+        <w:t>CacheView</w:t>
+      </w:r>
+      <w:proofErr w:type="spellEnd"/>
+      <w:r>
+        <w:t xml:space="preserve"> guidance and basic component-author declarations. However, it doesn't fully cover third-party component-authoring patterns, conditional </w:t>
+      </w:r>
+      <w:proofErr w:type="spellStart"/>
+      <w:r>
+        <w:t>rerender</w:t>
+      </w:r>
+      <w:proofErr w:type="spellEnd"/>
+      <w:r>
+        <w:t xml:space="preserve"> and caching behavior, unconditional refusal scenarios, or the actionable exception-message expectations validated by this issue.</w:t>
+      </w:r>
+    </w:p>
     <w:p>
       <w:pPr>
         <w:rPr>
@@ -2264,6 +3814,7 @@
         <w:spacing w:line="240" w:lineRule="auto"/>
       </w:pPr>
       <w:r>
+        <w:lastRenderedPageBreak/>
         <w:t>This warning is unrelated to this validation.</w:t>
       </w:r>
     </w:p>
@@ -2291,7 +3842,7 @@
                     <pic:cNvPicPr/>
                   </pic:nvPicPr>
                   <pic:blipFill>
-                    <a:blip r:embed="rId18"/>
+                    <a:blip r:embed="rId25"/>
                     <a:stretch>
                       <a:fillRect/>
                     </a:stretch>
@@ -2318,103 +3869,98 @@
     <w:p>
       <w:pPr>
         <w:spacing w:line="240" w:lineRule="auto"/>
-        <w:rPr>
-          <w:sz w:val="28"/>
-          <w:szCs w:val="28"/>
-        </w:rPr>
-      </w:pPr>
-      <w:r>
-        <w:rPr>
-          <w:sz w:val="28"/>
-          <w:szCs w:val="28"/>
-        </w:rPr>
-        <w:t>.</w:t>
-      </w:r>
+      </w:pPr>
+    </w:p>
+    <w:p>
+      <w:pPr>
+        <w:spacing w:line="240" w:lineRule="auto"/>
+      </w:pPr>
       <w:r>
         <w:rPr>
           <w:b/>
           <w:bCs/>
-          <w:sz w:val="28"/>
-          <w:szCs w:val="28"/>
+          <w:sz w:val="32"/>
+          <w:szCs w:val="32"/>
         </w:rPr>
-        <w:t>NET SDK</w:t>
-      </w:r>
-      <w:r>
+        <w:t>Unexpected Behavior</w:t>
+      </w:r>
+    </w:p>
+    <w:p>
+      <w:pPr>
+        <w:spacing w:line="240" w:lineRule="auto"/>
+      </w:pPr>
+      <w:r>
+        <w:t xml:space="preserve">No unexpected </w:t>
+      </w:r>
+      <w:proofErr w:type="spellStart"/>
+      <w:r>
+        <w:t>CacheView</w:t>
+      </w:r>
+      <w:proofErr w:type="spellEnd"/>
+      <w:r>
+        <w:t xml:space="preserve"> behavior was observed during validation. All scenarios behaved as described in the issue requirements and documentation.</w:t>
+      </w:r>
+    </w:p>
+    <w:p>
+      <w:pPr>
+        <w:spacing w:line="240" w:lineRule="auto"/>
         <w:rPr>
           <w:b/>
           <w:bCs/>
-          <w:sz w:val="28"/>
-          <w:szCs w:val="28"/>
+          <w:sz w:val="32"/>
+          <w:szCs w:val="32"/>
         </w:rPr>
-        <w:t xml:space="preserve"> Detail</w:t>
-      </w:r>
-      <w:r>
+      </w:pPr>
+    </w:p>
+    <w:p>
+      <w:pPr>
+        <w:spacing w:line="240" w:lineRule="auto"/>
         <w:rPr>
           <w:b/>
           <w:bCs/>
-          <w:sz w:val="28"/>
-          <w:szCs w:val="28"/>
+          <w:sz w:val="32"/>
+          <w:szCs w:val="32"/>
         </w:rPr>
-        <w:t>:</w:t>
-      </w:r>
-    </w:p>
-    <w:p>
-      <w:pPr>
-        <w:spacing w:line="240" w:lineRule="auto"/>
-      </w:pPr>
-      <w:r>
-        <w:drawing>
-          <wp:inline distT="0" distB="0" distL="0" distR="0" wp14:anchorId="3DB1CED4" wp14:editId="7ADDE652">
-            <wp:extent cx="4632148" cy="2377440"/>
-            <wp:effectExtent l="0" t="0" r="0" b="3810"/>
-            <wp:docPr id="1344531848" name="Picture 1"/>
-            <wp:cNvGraphicFramePr>
-              <a:graphicFrameLocks xmlns:a="http://schemas.openxmlformats.org/drawingml/2006/main" noChangeAspect="1"/>
-            </wp:cNvGraphicFramePr>
-            <a:graphic xmlns:a="http://schemas.openxmlformats.org/drawingml/2006/main">
-              <a:graphicData uri="http://schemas.openxmlformats.org/drawingml/2006/picture">
-                <pic:pic xmlns:pic="http://schemas.openxmlformats.org/drawingml/2006/picture">
-                  <pic:nvPicPr>
-                    <pic:cNvPr id="1344531848" name=""/>
-                    <pic:cNvPicPr/>
-                  </pic:nvPicPr>
-                  <pic:blipFill>
-                    <a:blip r:embed="rId19"/>
-                    <a:stretch>
-                      <a:fillRect/>
-                    </a:stretch>
-                  </pic:blipFill>
-                  <pic:spPr>
-                    <a:xfrm>
-                      <a:off x="0" y="0"/>
-                      <a:ext cx="4634246" cy="2378517"/>
-                    </a:xfrm>
-                    <a:prstGeom prst="rect">
-                      <a:avLst/>
-                    </a:prstGeom>
-                  </pic:spPr>
-                </pic:pic>
-              </a:graphicData>
-            </a:graphic>
-          </wp:inline>
-        </w:drawing>
-      </w:r>
-    </w:p>
-    <w:p>
-      <w:pPr>
-        <w:spacing w:line="240" w:lineRule="auto"/>
-      </w:pPr>
-    </w:p>
-    <w:p>
-      <w:pPr>
-        <w:spacing w:line="240" w:lineRule="auto"/>
       </w:pPr>
       <w:r>
         <w:rPr>
           <w:b/>
           <w:bCs/>
-          <w:sz w:val="28"/>
-          <w:szCs w:val="28"/>
+          <w:sz w:val="32"/>
+          <w:szCs w:val="32"/>
+        </w:rPr>
+        <w:t>Configuration Differences</w:t>
+      </w:r>
+    </w:p>
+    <w:p>
+      <w:pPr>
+        <w:spacing w:line="240" w:lineRule="auto"/>
+      </w:pPr>
+      <w:r>
+        <w:t xml:space="preserve">Static SSR was the only supported configuration required for this validation. No configuration-specific differences were </w:t>
+      </w:r>
+      <w:r>
+        <w:t>observed,</w:t>
+      </w:r>
+      <w:r>
+        <w:t xml:space="preserve"> and no additional render modes were applicable to this scenario.</w:t>
+      </w:r>
+    </w:p>
+    <w:p>
+      <w:pPr>
+        <w:spacing w:line="240" w:lineRule="auto"/>
+      </w:pPr>
+    </w:p>
+    <w:p>
+      <w:pPr>
+        <w:spacing w:line="240" w:lineRule="auto"/>
+      </w:pPr>
+      <w:r>
+        <w:rPr>
+          <w:b/>
+          <w:bCs/>
+          <w:sz w:val="32"/>
+          <w:szCs w:val="32"/>
         </w:rPr>
         <w:t xml:space="preserve">Not Covered: </w:t>
       </w:r>
@@ -2435,6 +3981,242 @@
 <file path=word/numbering.xml><?xml version="1.0" encoding="utf-8"?>
 <w:numbering xmlns:wpc="http://schemas.microsoft.com/office/word/2010/wordprocessingCanvas" xmlns:cx="http://schemas.microsoft.com/office/drawing/2014/chartex" xmlns:cx1="http://schemas.microsoft.com/office/drawing/2015/9/8/chartex" xmlns:cx2="http://schemas.microsoft.com/office/drawing/2015/10/21/chartex" xmlns:cx3="http://schemas.microsoft.com/office/drawing/2016/5/9/chartex" xmlns:cx4="http://schemas.microsoft.com/office/drawing/2016/5/10/chartex" xmlns:cx5="http://schemas.microsoft.com/office/drawing/2016/5/11/chartex" xmlns:cx6="http://schemas.microsoft.com/office/drawing/2016/5/12/chartex" xmlns:cx7="http://schemas.microsoft.com/office/drawing/2016/5/13/chartex" xmlns:cx8="http://schemas.microsoft.com/office/drawing/2016/5/14/chartex" xmlns:mc="http://schemas.openxmlformats.org/markup-compatibility/2006" xmlns:aink="http://schemas.microsoft.com/office/drawing/2016/ink" xmlns:am3d="http://schemas.microsoft.com/office/drawing/2017/model3d" xmlns:o="urn:schemas-microsoft-com:office:office" xmlns:oel="http://schemas.microsoft.com/office/2019/extlst" xmlns:r="http://schemas.openxmlformats.org/officeDocument/2006/relationships" xmlns:m="http://schemas.openxmlformats.org/officeDocument/2006/math" xmlns:v="urn:schemas-microsoft-com:vml" xmlns:wp14="http://schemas.microsoft.com/office/word/2010/wordprocessingDrawing" xmlns:wp="http://schemas.openxmlformats.org/drawingml/2006/wordprocessingDrawing" xmlns:w10="urn:schemas-microsoft-com:office:word" xmlns:w="http://schemas.openxmlformats.org/wordprocessingml/2006/main" xmlns:w14="http://schemas.microsoft.com/office/word/2010/wordml" xmlns:w15="http://schemas.microsoft.com/office/word/2012/wordml" xmlns:w16cex="http://schemas.microsoft.com/office/word/2018/wordml/cex" xmlns:w16cid="http://schemas.microsoft.com/office/word/2016/wordml/cid" xmlns:w16="http://schemas.microsoft.com/office/word/2018/wordml" xmlns:w16du="http://schemas.microsoft.com/office/word/2023/wordml/word16du" xmlns:w16sdtdh="http://schemas.microsoft.com/office/word/2020/wordml/sdtdatahash" xmlns:w16sdtfl="http://schemas.microsoft.com/office/word/2024/wordml/sdtformatlock" xmlns:w16se="http://schemas.microsoft.com/office/word/2015/wordml/symex" xmlns:wpg="http://schemas.microsoft.com/office/word/2010/wordprocessingGroup" xmlns:wpi="http://schemas.microsoft.com/office/word/2010/wordprocessingInk" xmlns:wne="http://schemas.microsoft.com/office/word/2006/wordml" xmlns:wps="http://schemas.microsoft.com/office/word/2010/wordprocessingShape" mc:Ignorable="w14 w15 w16se w16cid w16 w16cex w16sdtdh w16sdtfl w16du wp14">
   <w:abstractNum w:abstractNumId="0" w15:restartNumberingAfterBreak="0">
+    <w:nsid w:val="FFFFFFFE"/>
+    <w:multiLevelType w:val="singleLevel"/>
+    <w:tmpl w:val="2C1483D6"/>
+    <w:lvl w:ilvl="0">
+      <w:numFmt w:val="bullet"/>
+      <w:lvlText w:val="*"/>
+      <w:lvlJc w:val="left"/>
+    </w:lvl>
+  </w:abstractNum>
+  <w:abstractNum w:abstractNumId="1" w15:restartNumberingAfterBreak="0">
+    <w:nsid w:val="21847CB5"/>
+    <w:multiLevelType w:val="hybridMultilevel"/>
+    <w:tmpl w:val="E13C6370"/>
+    <w:lvl w:ilvl="0" w:tplc="04090001">
+      <w:start w:val="1"/>
+      <w:numFmt w:val="bullet"/>
+      <w:lvlText w:val=""/>
+      <w:lvlJc w:val="left"/>
+      <w:pPr>
+        <w:ind w:left="720" w:hanging="360"/>
+      </w:pPr>
+      <w:rPr>
+        <w:rFonts w:ascii="Symbol" w:hAnsi="Symbol" w:hint="default"/>
+      </w:rPr>
+    </w:lvl>
+    <w:lvl w:ilvl="1" w:tplc="04090003" w:tentative="1">
+      <w:start w:val="1"/>
+      <w:numFmt w:val="bullet"/>
+      <w:lvlText w:val="o"/>
+      <w:lvlJc w:val="left"/>
+      <w:pPr>
+        <w:ind w:left="1440" w:hanging="360"/>
+      </w:pPr>
+      <w:rPr>
+        <w:rFonts w:ascii="Courier New" w:hAnsi="Courier New" w:cs="Courier New" w:hint="default"/>
+      </w:rPr>
+    </w:lvl>
+    <w:lvl w:ilvl="2" w:tplc="04090005" w:tentative="1">
+      <w:start w:val="1"/>
+      <w:numFmt w:val="bullet"/>
+      <w:lvlText w:val=""/>
+      <w:lvlJc w:val="left"/>
+      <w:pPr>
+        <w:ind w:left="2160" w:hanging="360"/>
+      </w:pPr>
+      <w:rPr>
+        <w:rFonts w:ascii="Wingdings" w:hAnsi="Wingdings" w:hint="default"/>
+      </w:rPr>
+    </w:lvl>
+    <w:lvl w:ilvl="3" w:tplc="04090001" w:tentative="1">
+      <w:start w:val="1"/>
+      <w:numFmt w:val="bullet"/>
+      <w:lvlText w:val=""/>
+      <w:lvlJc w:val="left"/>
+      <w:pPr>
+        <w:ind w:left="2880" w:hanging="360"/>
+      </w:pPr>
+      <w:rPr>
+        <w:rFonts w:ascii="Symbol" w:hAnsi="Symbol" w:hint="default"/>
+      </w:rPr>
+    </w:lvl>
+    <w:lvl w:ilvl="4" w:tplc="04090003" w:tentative="1">
+      <w:start w:val="1"/>
+      <w:numFmt w:val="bullet"/>
+      <w:lvlText w:val="o"/>
+      <w:lvlJc w:val="left"/>
+      <w:pPr>
+        <w:ind w:left="3600" w:hanging="360"/>
+      </w:pPr>
+      <w:rPr>
+        <w:rFonts w:ascii="Courier New" w:hAnsi="Courier New" w:cs="Courier New" w:hint="default"/>
+      </w:rPr>
+    </w:lvl>
+    <w:lvl w:ilvl="5" w:tplc="04090005" w:tentative="1">
+      <w:start w:val="1"/>
+      <w:numFmt w:val="bullet"/>
+      <w:lvlText w:val=""/>
+      <w:lvlJc w:val="left"/>
+      <w:pPr>
+        <w:ind w:left="4320" w:hanging="360"/>
+      </w:pPr>
+      <w:rPr>
+        <w:rFonts w:ascii="Wingdings" w:hAnsi="Wingdings" w:hint="default"/>
+      </w:rPr>
+    </w:lvl>
+    <w:lvl w:ilvl="6" w:tplc="04090001" w:tentative="1">
+      <w:start w:val="1"/>
+      <w:numFmt w:val="bullet"/>
+      <w:lvlText w:val=""/>
+      <w:lvlJc w:val="left"/>
+      <w:pPr>
+        <w:ind w:left="5040" w:hanging="360"/>
+      </w:pPr>
+      <w:rPr>
+        <w:rFonts w:ascii="Symbol" w:hAnsi="Symbol" w:hint="default"/>
+      </w:rPr>
+    </w:lvl>
+    <w:lvl w:ilvl="7" w:tplc="04090003" w:tentative="1">
+      <w:start w:val="1"/>
+      <w:numFmt w:val="bullet"/>
+      <w:lvlText w:val="o"/>
+      <w:lvlJc w:val="left"/>
+      <w:pPr>
+        <w:ind w:left="5760" w:hanging="360"/>
+      </w:pPr>
+      <w:rPr>
+        <w:rFonts w:ascii="Courier New" w:hAnsi="Courier New" w:cs="Courier New" w:hint="default"/>
+      </w:rPr>
+    </w:lvl>
+    <w:lvl w:ilvl="8" w:tplc="04090005" w:tentative="1">
+      <w:start w:val="1"/>
+      <w:numFmt w:val="bullet"/>
+      <w:lvlText w:val=""/>
+      <w:lvlJc w:val="left"/>
+      <w:pPr>
+        <w:ind w:left="6480" w:hanging="360"/>
+      </w:pPr>
+      <w:rPr>
+        <w:rFonts w:ascii="Wingdings" w:hAnsi="Wingdings" w:hint="default"/>
+      </w:rPr>
+    </w:lvl>
+  </w:abstractNum>
+  <w:abstractNum w:abstractNumId="2" w15:restartNumberingAfterBreak="0">
+    <w:nsid w:val="2F771342"/>
+    <w:multiLevelType w:val="hybridMultilevel"/>
+    <w:tmpl w:val="200E2608"/>
+    <w:lvl w:ilvl="0" w:tplc="04090001">
+      <w:start w:val="1"/>
+      <w:numFmt w:val="bullet"/>
+      <w:lvlText w:val=""/>
+      <w:lvlJc w:val="left"/>
+      <w:pPr>
+        <w:ind w:left="720" w:hanging="360"/>
+      </w:pPr>
+      <w:rPr>
+        <w:rFonts w:ascii="Symbol" w:hAnsi="Symbol" w:hint="default"/>
+      </w:rPr>
+    </w:lvl>
+    <w:lvl w:ilvl="1" w:tplc="04090003" w:tentative="1">
+      <w:start w:val="1"/>
+      <w:numFmt w:val="bullet"/>
+      <w:lvlText w:val="o"/>
+      <w:lvlJc w:val="left"/>
+      <w:pPr>
+        <w:ind w:left="1440" w:hanging="360"/>
+      </w:pPr>
+      <w:rPr>
+        <w:rFonts w:ascii="Courier New" w:hAnsi="Courier New" w:cs="Courier New" w:hint="default"/>
+      </w:rPr>
+    </w:lvl>
+    <w:lvl w:ilvl="2" w:tplc="04090005" w:tentative="1">
+      <w:start w:val="1"/>
+      <w:numFmt w:val="bullet"/>
+      <w:lvlText w:val=""/>
+      <w:lvlJc w:val="left"/>
+      <w:pPr>
+        <w:ind w:left="2160" w:hanging="360"/>
+      </w:pPr>
+      <w:rPr>
+        <w:rFonts w:ascii="Wingdings" w:hAnsi="Wingdings" w:hint="default"/>
+      </w:rPr>
+    </w:lvl>
+    <w:lvl w:ilvl="3" w:tplc="04090001" w:tentative="1">
+      <w:start w:val="1"/>
+      <w:numFmt w:val="bullet"/>
+      <w:lvlText w:val=""/>
+      <w:lvlJc w:val="left"/>
+      <w:pPr>
+        <w:ind w:left="2880" w:hanging="360"/>
+      </w:pPr>
+      <w:rPr>
+        <w:rFonts w:ascii="Symbol" w:hAnsi="Symbol" w:hint="default"/>
+      </w:rPr>
+    </w:lvl>
+    <w:lvl w:ilvl="4" w:tplc="04090003" w:tentative="1">
+      <w:start w:val="1"/>
+      <w:numFmt w:val="bullet"/>
+      <w:lvlText w:val="o"/>
+      <w:lvlJc w:val="left"/>
+      <w:pPr>
+        <w:ind w:left="3600" w:hanging="360"/>
+      </w:pPr>
+      <w:rPr>
+        <w:rFonts w:ascii="Courier New" w:hAnsi="Courier New" w:cs="Courier New" w:hint="default"/>
+      </w:rPr>
+    </w:lvl>
+    <w:lvl w:ilvl="5" w:tplc="04090005" w:tentative="1">
+      <w:start w:val="1"/>
+      <w:numFmt w:val="bullet"/>
+      <w:lvlText w:val=""/>
+      <w:lvlJc w:val="left"/>
+      <w:pPr>
+        <w:ind w:left="4320" w:hanging="360"/>
+      </w:pPr>
+      <w:rPr>
+        <w:rFonts w:ascii="Wingdings" w:hAnsi="Wingdings" w:hint="default"/>
+      </w:rPr>
+    </w:lvl>
+    <w:lvl w:ilvl="6" w:tplc="04090001" w:tentative="1">
+      <w:start w:val="1"/>
+      <w:numFmt w:val="bullet"/>
+      <w:lvlText w:val=""/>
+      <w:lvlJc w:val="left"/>
+      <w:pPr>
+        <w:ind w:left="5040" w:hanging="360"/>
+      </w:pPr>
+      <w:rPr>
+        <w:rFonts w:ascii="Symbol" w:hAnsi="Symbol" w:hint="default"/>
+      </w:rPr>
+    </w:lvl>
+    <w:lvl w:ilvl="7" w:tplc="04090003" w:tentative="1">
+      <w:start w:val="1"/>
+      <w:numFmt w:val="bullet"/>
+      <w:lvlText w:val="o"/>
+      <w:lvlJc w:val="left"/>
+      <w:pPr>
+        <w:ind w:left="5760" w:hanging="360"/>
+      </w:pPr>
+      <w:rPr>
+        <w:rFonts w:ascii="Courier New" w:hAnsi="Courier New" w:cs="Courier New" w:hint="default"/>
+      </w:rPr>
+    </w:lvl>
+    <w:lvl w:ilvl="8" w:tplc="04090005" w:tentative="1">
+      <w:start w:val="1"/>
+      <w:numFmt w:val="bullet"/>
+      <w:lvlText w:val=""/>
+      <w:lvlJc w:val="left"/>
+      <w:pPr>
+        <w:ind w:left="6480" w:hanging="360"/>
+      </w:pPr>
+      <w:rPr>
+        <w:rFonts w:ascii="Wingdings" w:hAnsi="Wingdings" w:hint="default"/>
+      </w:rPr>
+    </w:lvl>
+  </w:abstractNum>
+  <w:abstractNum w:abstractNumId="3" w15:restartNumberingAfterBreak="0">
     <w:nsid w:val="3DCE3A6C"/>
     <w:multiLevelType w:val="multilevel"/>
     <w:tmpl w:val="0A4C80F2"/>
@@ -2583,7 +4365,7 @@
       </w:rPr>
     </w:lvl>
   </w:abstractNum>
-  <w:abstractNum w:abstractNumId="1" w15:restartNumberingAfterBreak="0">
+  <w:abstractNum w:abstractNumId="4" w15:restartNumberingAfterBreak="0">
     <w:nsid w:val="5C04609C"/>
     <w:multiLevelType w:val="multilevel"/>
     <w:tmpl w:val="FE743AC8"/>
@@ -2732,7 +4514,7 @@
       </w:rPr>
     </w:lvl>
   </w:abstractNum>
-  <w:abstractNum w:abstractNumId="2" w15:restartNumberingAfterBreak="0">
+  <w:abstractNum w:abstractNumId="5" w15:restartNumberingAfterBreak="0">
     <w:nsid w:val="70DE425F"/>
     <w:multiLevelType w:val="hybridMultilevel"/>
     <w:tmpl w:val="E294D9E6"/>
@@ -2845,7 +4627,7 @@
       </w:rPr>
     </w:lvl>
   </w:abstractNum>
-  <w:abstractNum w:abstractNumId="3" w15:restartNumberingAfterBreak="0">
+  <w:abstractNum w:abstractNumId="6" w15:restartNumberingAfterBreak="0">
     <w:nsid w:val="7F583735"/>
     <w:multiLevelType w:val="multilevel"/>
     <w:tmpl w:val="58345F60"/>
@@ -2995,16 +4777,37 @@
     </w:lvl>
   </w:abstractNum>
   <w:num w:numId="1" w16cid:durableId="835611551">
+    <w:abstractNumId w:val="6"/>
+  </w:num>
+  <w:num w:numId="2" w16cid:durableId="782112220">
     <w:abstractNumId w:val="3"/>
   </w:num>
-  <w:num w:numId="2" w16cid:durableId="782112220">
-    <w:abstractNumId w:val="0"/>
-  </w:num>
   <w:num w:numId="3" w16cid:durableId="1241217463">
-    <w:abstractNumId w:val="1"/>
+    <w:abstractNumId w:val="4"/>
   </w:num>
   <w:num w:numId="4" w16cid:durableId="1137726542">
+    <w:abstractNumId w:val="5"/>
+  </w:num>
+  <w:num w:numId="5" w16cid:durableId="17438014">
     <w:abstractNumId w:val="2"/>
+  </w:num>
+  <w:num w:numId="6" w16cid:durableId="598609094">
+    <w:abstractNumId w:val="0"/>
+    <w:lvlOverride w:ilvl="0">
+      <w:lvl w:ilvl="0">
+        <w:start w:val="1"/>
+        <w:numFmt w:val="bullet"/>
+        <w:lvlText w:val="·"/>
+        <w:legacy w:legacy="1" w:legacySpace="0" w:legacyIndent="0"/>
+        <w:lvlJc w:val="left"/>
+        <w:rPr>
+          <w:rFonts w:ascii="Times New Roman" w:hAnsi="Times New Roman" w:cs="Times New Roman" w:hint="default"/>
+        </w:rPr>
+      </w:lvl>
+    </w:lvlOverride>
+  </w:num>
+  <w:num w:numId="7" w16cid:durableId="1375352158">
+    <w:abstractNumId w:val="1"/>
   </w:num>
 </w:numbering>
 </file>
@@ -3409,6 +5212,7 @@
   <w:style w:type="paragraph" w:default="1" w:styleId="Normal">
     <w:name w:val="Normal"/>
     <w:qFormat/>
+    <w:rsid w:val="004033A6"/>
   </w:style>
   <w:style w:type="paragraph" w:styleId="Heading1">
     <w:name w:val="heading 1"/>

</xml_diff>

<commit_message>
Updated the report with cache-id comparisons
</commit_message>
<xml_diff>
--- a/Evidence/Components that refuse to be cached in CacheView.docx
+++ b/Evidence/Components that refuse to be cached in CacheView.docx
@@ -267,6 +267,122 @@
           <w:sz w:val="32"/>
           <w:szCs w:val="32"/>
         </w:rPr>
+        <w:t>Repository Revision</w:t>
+      </w:r>
+    </w:p>
+    <w:p>
+      <w:pPr>
+        <w:ind w:left="720"/>
+      </w:pPr>
+      <w:r>
+        <w:rPr>
+          <w:b/>
+          <w:bCs/>
+        </w:rPr>
+        <w:t>Repository:</w:t>
+      </w:r>
+      <w:r>
+        <w:rPr>
+          <w:b/>
+          <w:bCs/>
+        </w:rPr>
+        <w:t xml:space="preserve"> </w:t>
+      </w:r>
+      <w:hyperlink r:id="rId7" w:history="1">
+        <w:proofErr w:type="spellStart"/>
+        <w:r>
+          <w:rPr>
+            <w:rStyle w:val="Hyperlink"/>
+          </w:rPr>
+          <w:t>BrundhaVelusa</w:t>
+        </w:r>
+        <w:r>
+          <w:rPr>
+            <w:rStyle w:val="Hyperlink"/>
+          </w:rPr>
+          <w:t>m</w:t>
+        </w:r>
+        <w:r>
+          <w:rPr>
+            <w:rStyle w:val="Hyperlink"/>
+          </w:rPr>
+          <w:t>y</w:t>
+        </w:r>
+        <w:proofErr w:type="spellEnd"/>
+        <w:r>
+          <w:rPr>
+            <w:rStyle w:val="Hyperlink"/>
+          </w:rPr>
+          <w:t>/</w:t>
+        </w:r>
+        <w:proofErr w:type="spellStart"/>
+        <w:r>
+          <w:rPr>
+            <w:rStyle w:val="Hyperlink"/>
+          </w:rPr>
+          <w:t>CacheViewRefusalValidation</w:t>
+        </w:r>
+        <w:proofErr w:type="spellEnd"/>
+      </w:hyperlink>
+    </w:p>
+    <w:p>
+      <w:pPr>
+        <w:ind w:left="720"/>
+      </w:pPr>
+      <w:r>
+        <w:rPr>
+          <w:b/>
+          <w:bCs/>
+        </w:rPr>
+        <w:t>Branch:</w:t>
+      </w:r>
+      <w:r>
+        <w:t xml:space="preserve"> </w:t>
+      </w:r>
+      <w:r>
+        <w:t>main</w:t>
+      </w:r>
+    </w:p>
+    <w:p>
+      <w:pPr>
+        <w:ind w:left="720"/>
+      </w:pPr>
+      <w:r>
+        <w:rPr>
+          <w:b/>
+          <w:bCs/>
+        </w:rPr>
+        <w:t>Commit Tested:</w:t>
+      </w:r>
+      <w:r>
+        <w:t xml:space="preserve"> </w:t>
+      </w:r>
+      <w:hyperlink r:id="rId8" w:history="1">
+        <w:r>
+          <w:rPr>
+            <w:rStyle w:val="Hyperlink"/>
+          </w:rPr>
+          <w:t>31e0cd86ba4ab711c3daf4f24af080037e71604b</w:t>
+        </w:r>
+      </w:hyperlink>
+    </w:p>
+    <w:p>
+      <w:pPr>
+        <w:rPr>
+          <w:b/>
+          <w:bCs/>
+          <w:sz w:val="32"/>
+          <w:szCs w:val="32"/>
+        </w:rPr>
+      </w:pPr>
+      <w:r>
+        <w:rPr>
+          <w:b/>
+          <w:bCs/>
+          <w:sz w:val="32"/>
+          <w:szCs w:val="32"/>
+        </w:rPr>
+        <w:lastRenderedPageBreak/>
         <w:t>Validation Methodology</w:t>
       </w:r>
     </w:p>
@@ -302,6 +418,75 @@
     </w:p>
     <w:p>
       <w:pPr>
+        <w:pStyle w:val="ListParagraph"/>
+        <w:numPr>
+          <w:ilvl w:val="0"/>
+          <w:numId w:val="4"/>
+        </w:numPr>
+      </w:pPr>
+      <w:r>
+        <w:t>Repeatable comparison records were retained through:</w:t>
+      </w:r>
+    </w:p>
+    <w:p>
+      <w:pPr>
+        <w:pStyle w:val="ListParagraph"/>
+        <w:numPr>
+          <w:ilvl w:val="1"/>
+          <w:numId w:val="4"/>
+        </w:numPr>
+      </w:pPr>
+      <w:r>
+        <w:t>S</w:t>
+      </w:r>
+      <w:r>
+        <w:t>creenshots</w:t>
+      </w:r>
+      <w:r>
+        <w:t xml:space="preserve"> and </w:t>
+      </w:r>
+      <w:r>
+        <w:t>video recordings</w:t>
+      </w:r>
+    </w:p>
+    <w:p>
+      <w:pPr>
+        <w:pStyle w:val="ListParagraph"/>
+        <w:numPr>
+          <w:ilvl w:val="1"/>
+          <w:numId w:val="4"/>
+        </w:numPr>
+      </w:pPr>
+      <w:r>
+        <w:t>exception captures</w:t>
+      </w:r>
+    </w:p>
+    <w:p>
+      <w:pPr>
+        <w:pStyle w:val="ListParagraph"/>
+        <w:numPr>
+          <w:ilvl w:val="1"/>
+          <w:numId w:val="4"/>
+        </w:numPr>
+      </w:pPr>
+      <w:r>
+        <w:t>cache ID comparisons</w:t>
+      </w:r>
+    </w:p>
+    <w:p>
+      <w:pPr>
+        <w:pStyle w:val="ListParagraph"/>
+        <w:numPr>
+          <w:ilvl w:val="1"/>
+          <w:numId w:val="4"/>
+        </w:numPr>
+      </w:pPr>
+      <w:r>
+        <w:t>sorting output comparisons</w:t>
+      </w:r>
+    </w:p>
+    <w:p>
+      <w:pPr>
         <w:rPr>
           <w:b/>
           <w:bCs/>
@@ -316,7 +501,6 @@
           <w:sz w:val="32"/>
           <w:szCs w:val="32"/>
         </w:rPr>
-        <w:lastRenderedPageBreak/>
         <w:t>Checks:</w:t>
       </w:r>
     </w:p>
@@ -564,15 +748,7 @@
             </w:r>
             <w:proofErr w:type="spellEnd"/>
             <w:r>
-              <w:t xml:space="preserve"> was </w:t>
-            </w:r>
-            <w:proofErr w:type="gramStart"/>
-            <w:r>
-              <w:t>thrown</w:t>
-            </w:r>
-            <w:proofErr w:type="gramEnd"/>
-            <w:r>
-              <w:t xml:space="preserve">. Error message identified </w:t>
+              <w:t xml:space="preserve"> was thrown. Error message identified </w:t>
             </w:r>
             <w:proofErr w:type="spellStart"/>
             <w:r>
@@ -604,7 +780,7 @@
             <w:r>
               <w:t xml:space="preserve">Refer to </w:t>
             </w:r>
-            <w:hyperlink r:id="rId7" w:history="1">
+            <w:hyperlink r:id="rId9" w:history="1">
               <w:r>
                 <w:rPr>
                   <w:rStyle w:val="Hyperlink"/>
@@ -781,15 +957,7 @@
             </w:r>
             <w:proofErr w:type="spellEnd"/>
             <w:r>
-              <w:t xml:space="preserve"> was </w:t>
-            </w:r>
-            <w:proofErr w:type="gramStart"/>
-            <w:r>
-              <w:t>thrown</w:t>
-            </w:r>
-            <w:proofErr w:type="gramEnd"/>
-            <w:r>
-              <w:t xml:space="preserve">. Error message identified </w:t>
+              <w:t xml:space="preserve"> was thrown. Error message identified </w:t>
             </w:r>
             <w:proofErr w:type="spellStart"/>
             <w:r>
@@ -821,7 +989,7 @@
             <w:r>
               <w:t xml:space="preserve">Refer to </w:t>
             </w:r>
-            <w:hyperlink r:id="rId8" w:history="1">
+            <w:hyperlink r:id="rId10" w:history="1">
               <w:r>
                 <w:rPr>
                   <w:rStyle w:val="Hyperlink"/>
@@ -880,6 +1048,7 @@
             </w:r>
             <w:proofErr w:type="spellStart"/>
             <w:r>
+              <w:lastRenderedPageBreak/>
               <w:t>VaryByQuery</w:t>
             </w:r>
             <w:proofErr w:type="spellEnd"/>
@@ -904,6 +1073,7 @@
               <w:spacing w:after="160" w:line="278" w:lineRule="auto"/>
             </w:pPr>
             <w:r>
+              <w:lastRenderedPageBreak/>
               <w:t>Works Properly</w:t>
             </w:r>
           </w:p>
@@ -1070,15 +1240,7 @@
             </w:r>
             <w:proofErr w:type="spellEnd"/>
             <w:r>
-              <w:t xml:space="preserve"> was </w:t>
-            </w:r>
-            <w:proofErr w:type="gramStart"/>
-            <w:r>
-              <w:t>thrown</w:t>
-            </w:r>
-            <w:proofErr w:type="gramEnd"/>
-            <w:r>
-              <w:t xml:space="preserve">. Error message identified </w:t>
+              <w:t xml:space="preserve"> was thrown. Error message identified </w:t>
             </w:r>
             <w:proofErr w:type="spellStart"/>
             <w:r>
@@ -1102,7 +1264,7 @@
             <w:r>
               <w:t xml:space="preserve">Refer to </w:t>
             </w:r>
-            <w:hyperlink r:id="rId9" w:history="1">
+            <w:hyperlink r:id="rId11" w:history="1">
               <w:r>
                 <w:rPr>
                   <w:rStyle w:val="Hyperlink"/>
@@ -1130,7 +1292,6 @@
               <w:spacing w:after="160" w:line="278" w:lineRule="auto"/>
             </w:pPr>
             <w:r>
-              <w:lastRenderedPageBreak/>
               <w:t>8</w:t>
             </w:r>
           </w:p>
@@ -1235,7 +1396,7 @@
             <w:r>
               <w:t xml:space="preserve">Refer to </w:t>
             </w:r>
-            <w:hyperlink r:id="rId10" w:history="1">
+            <w:hyperlink r:id="rId12" w:history="1">
               <w:r>
                 <w:rPr>
                   <w:rStyle w:val="Hyperlink"/>
@@ -1314,13 +1475,8 @@
             <w:pPr>
               <w:spacing w:after="160" w:line="278" w:lineRule="auto"/>
             </w:pPr>
-            <w:proofErr w:type="gramStart"/>
-            <w:r>
-              <w:t>Component</w:t>
-            </w:r>
-            <w:proofErr w:type="gramEnd"/>
-            <w:r>
-              <w:t xml:space="preserve"> rendered successfully when removed from the cache boundary.</w:t>
+            <w:r>
+              <w:t>Component rendered successfully when removed from the cache boundary.</w:t>
             </w:r>
           </w:p>
         </w:tc>
@@ -1541,15 +1697,7 @@
               <w:spacing w:after="160" w:line="278" w:lineRule="auto"/>
             </w:pPr>
             <w:r>
-              <w:t xml:space="preserve">A new cache entry was created for the different cookie </w:t>
-            </w:r>
-            <w:proofErr w:type="gramStart"/>
-            <w:r>
-              <w:t>value</w:t>
-            </w:r>
-            <w:proofErr w:type="gramEnd"/>
-            <w:r>
-              <w:t xml:space="preserve"> and rendered correctly</w:t>
+              <w:t>A new cache entry was created for the different cookie value and rendered correctly</w:t>
             </w:r>
             <w:r>
               <w:t xml:space="preserve"> and </w:t>
@@ -1645,7 +1793,7 @@
             <w:r>
               <w:t xml:space="preserve">Refer to </w:t>
             </w:r>
-            <w:hyperlink r:id="rId11" w:history="1">
+            <w:hyperlink r:id="rId13" w:history="1">
               <w:r>
                 <w:rPr>
                   <w:rStyle w:val="Hyperlink"/>
@@ -1673,6 +1821,7 @@
               <w:spacing w:after="160" w:line="278" w:lineRule="auto"/>
             </w:pPr>
             <w:r>
+              <w:lastRenderedPageBreak/>
               <w:t>14</w:t>
             </w:r>
           </w:p>
@@ -1721,7 +1870,6 @@
         </w:tc>
       </w:tr>
     </w:tbl>
-    <w:p/>
     <w:p>
       <w:pPr>
         <w:rPr>
@@ -1733,24 +1881,13 @@
       </w:pPr>
     </w:p>
     <w:p>
-      <w:pPr>
+      <w:r>
         <w:rPr>
           <w:b/>
           <w:bCs/>
           <w:sz w:val="32"/>
           <w:szCs w:val="32"/>
         </w:rPr>
-      </w:pPr>
-    </w:p>
-    <w:p>
-      <w:r>
-        <w:rPr>
-          <w:b/>
-          <w:bCs/>
-          <w:sz w:val="32"/>
-          <w:szCs w:val="32"/>
-        </w:rPr>
-        <w:lastRenderedPageBreak/>
         <w:t>Evidence</w:t>
       </w:r>
     </w:p>
@@ -1844,7 +1981,7 @@
             <w:pPr>
               <w:spacing w:after="160" w:line="278" w:lineRule="auto"/>
             </w:pPr>
-            <w:hyperlink r:id="rId12" w:history="1">
+            <w:hyperlink r:id="rId14" w:history="1">
               <w:r>
                 <w:rPr>
                   <w:rStyle w:val="Hyperlink"/>
@@ -1889,7 +2026,7 @@
             <w:pPr>
               <w:spacing w:after="160" w:line="278" w:lineRule="auto"/>
             </w:pPr>
-            <w:hyperlink r:id="rId13" w:history="1">
+            <w:hyperlink r:id="rId15" w:history="1">
               <w:r>
                 <w:rPr>
                   <w:rStyle w:val="Hyperlink"/>
@@ -1934,7 +2071,7 @@
             <w:pPr>
               <w:spacing w:after="160" w:line="278" w:lineRule="auto"/>
             </w:pPr>
-            <w:hyperlink r:id="rId14" w:history="1">
+            <w:hyperlink r:id="rId16" w:history="1">
               <w:r>
                 <w:rPr>
                   <w:rStyle w:val="Hyperlink"/>
@@ -1979,7 +2116,7 @@
             <w:pPr>
               <w:spacing w:after="160" w:line="278" w:lineRule="auto"/>
             </w:pPr>
-            <w:hyperlink r:id="rId15" w:history="1">
+            <w:hyperlink r:id="rId17" w:history="1">
               <w:r>
                 <w:rPr>
                   <w:rStyle w:val="Hyperlink"/>
@@ -2016,7 +2153,7 @@
             <w:tcW w:w="5238" w:type="dxa"/>
           </w:tcPr>
           <w:p>
-            <w:hyperlink r:id="rId16" w:history="1">
+            <w:hyperlink r:id="rId18" w:history="1">
               <w:r>
                 <w:rPr>
                   <w:rStyle w:val="Hyperlink"/>
@@ -2056,7 +2193,7 @@
             <w:pPr>
               <w:spacing w:after="160" w:line="278" w:lineRule="auto"/>
             </w:pPr>
-            <w:hyperlink r:id="rId17" w:history="1">
+            <w:hyperlink r:id="rId19" w:history="1">
               <w:r>
                 <w:rPr>
                   <w:rStyle w:val="Hyperlink"/>
@@ -2096,7 +2233,7 @@
             <w:pPr>
               <w:spacing w:after="160" w:line="278" w:lineRule="auto"/>
             </w:pPr>
-            <w:hyperlink r:id="rId18" w:history="1">
+            <w:hyperlink r:id="rId20" w:history="1">
               <w:r>
                 <w:rPr>
                   <w:rStyle w:val="Hyperlink"/>
@@ -2141,7 +2278,7 @@
             <w:pPr>
               <w:spacing w:after="160" w:line="278" w:lineRule="auto"/>
             </w:pPr>
-            <w:hyperlink r:id="rId19" w:history="1">
+            <w:hyperlink r:id="rId21" w:history="1">
               <w:r>
                 <w:rPr>
                   <w:rStyle w:val="Hyperlink"/>
@@ -2176,7 +2313,7 @@
             <w:tcW w:w="5238" w:type="dxa"/>
           </w:tcPr>
           <w:p>
-            <w:hyperlink r:id="rId20" w:history="1">
+            <w:hyperlink r:id="rId22" w:history="1">
               <w:r>
                 <w:rPr>
                   <w:rStyle w:val="Hyperlink"/>
@@ -2216,7 +2353,7 @@
             <w:pPr>
               <w:spacing w:after="160" w:line="278" w:lineRule="auto"/>
             </w:pPr>
-            <w:hyperlink r:id="rId21" w:history="1">
+            <w:hyperlink r:id="rId23" w:history="1">
               <w:r>
                 <w:rPr>
                   <w:rStyle w:val="Hyperlink"/>
@@ -2243,15 +2380,7 @@
             </w:r>
             <w:proofErr w:type="spellEnd"/>
             <w:r>
-              <w:t xml:space="preserve"> </w:t>
-            </w:r>
-            <w:proofErr w:type="gramStart"/>
-            <w:r>
-              <w:t>cached</w:t>
-            </w:r>
-            <w:proofErr w:type="gramEnd"/>
-            <w:r>
-              <w:t xml:space="preserve"> with cookie variation</w:t>
+              <w:t xml:space="preserve"> cached with cookie variation</w:t>
             </w:r>
           </w:p>
         </w:tc>
@@ -2264,7 +2393,7 @@
             <w:pPr>
               <w:spacing w:after="160" w:line="278" w:lineRule="auto"/>
             </w:pPr>
-            <w:hyperlink r:id="rId22" w:history="1">
+            <w:hyperlink r:id="rId24" w:history="1">
               <w:r>
                 <w:rPr>
                   <w:rStyle w:val="Hyperlink"/>
@@ -2307,7 +2436,7 @@
             <w:pPr>
               <w:spacing w:after="160" w:line="278" w:lineRule="auto"/>
             </w:pPr>
-            <w:hyperlink r:id="rId23" w:history="1">
+            <w:hyperlink r:id="rId25" w:history="1">
               <w:r>
                 <w:rPr>
                   <w:rStyle w:val="Hyperlink"/>
@@ -2345,6 +2474,7 @@
           <w:sz w:val="32"/>
           <w:szCs w:val="32"/>
         </w:rPr>
+        <w:lastRenderedPageBreak/>
         <w:t xml:space="preserve">Exception </w:t>
       </w:r>
       <w:r>
@@ -2516,11 +2646,7 @@
             </w:r>
             <w:proofErr w:type="spellEnd"/>
             <w:r>
-              <w:t>. No source-</w:t>
-            </w:r>
-            <w:r>
-              <w:lastRenderedPageBreak/>
-              <w:t>code inspection was required.</w:t>
+              <w:t>. No source-code inspection was required.</w:t>
             </w:r>
           </w:p>
           <w:p>
@@ -2552,7 +2678,6 @@
                 <w:i/>
                 <w:iCs/>
               </w:rPr>
-              <w:lastRenderedPageBreak/>
               <w:t>InvalidOperationException</w:t>
             </w:r>
             <w:proofErr w:type="spellEnd"/>
@@ -2564,96 +2689,92 @@
               <w:t>: Component '</w:t>
             </w:r>
             <w:proofErr w:type="spellStart"/>
-            <w:proofErr w:type="gramStart"/>
             <w:r>
               <w:rPr>
                 <w:i/>
                 <w:iCs/>
               </w:rPr>
-              <w:t>Microsoft.AspNetCore.Components.Authorization</w:t>
-            </w:r>
-            <w:proofErr w:type="gramEnd"/>
+              <w:t>Microsoft.AspNetCore.Components.Authorization.AuthorizeView</w:t>
+            </w:r>
+            <w:proofErr w:type="spellEnd"/>
             <w:r>
               <w:rPr>
                 <w:i/>
                 <w:iCs/>
               </w:rPr>
-              <w:t>.AuthorizeView</w:t>
-            </w:r>
-            <w:proofErr w:type="spellEnd"/>
+              <w:t xml:space="preserve">' cannot be used inside a </w:t>
+            </w:r>
+            <w:proofErr w:type="spellStart"/>
             <w:r>
               <w:rPr>
                 <w:i/>
                 <w:iCs/>
               </w:rPr>
-              <w:t xml:space="preserve">' cannot be used inside a </w:t>
-            </w:r>
-            <w:proofErr w:type="spellStart"/>
+              <w:t>CacheView</w:t>
+            </w:r>
+            <w:proofErr w:type="spellEnd"/>
             <w:r>
               <w:rPr>
                 <w:i/>
                 <w:iCs/>
               </w:rPr>
-              <w:t>CacheView</w:t>
-            </w:r>
-            <w:proofErr w:type="spellEnd"/>
+              <w:t xml:space="preserve"> because its output depends on per-request state ([</w:t>
+            </w:r>
+            <w:proofErr w:type="spellStart"/>
             <w:r>
               <w:rPr>
                 <w:i/>
                 <w:iCs/>
               </w:rPr>
-              <w:t xml:space="preserve"> because its output depends on per-request state ([</w:t>
-            </w:r>
-            <w:proofErr w:type="spellStart"/>
-            <w:proofErr w:type="gramStart"/>
+              <w:t>CacheBehavior</w:t>
+            </w:r>
+            <w:proofErr w:type="spellEnd"/>
             <w:r>
               <w:rPr>
                 <w:i/>
                 <w:iCs/>
               </w:rPr>
-              <w:t>CacheBehavior</w:t>
-            </w:r>
-            <w:proofErr w:type="spellEnd"/>
+              <w:t>(</w:t>
+            </w:r>
+            <w:proofErr w:type="spellStart"/>
             <w:r>
               <w:rPr>
                 <w:i/>
                 <w:iCs/>
               </w:rPr>
-              <w:t>(</w:t>
-            </w:r>
-            <w:proofErr w:type="spellStart"/>
-            <w:proofErr w:type="gramEnd"/>
+              <w:t>CacheBehavior.Throw</w:t>
+            </w:r>
+            <w:proofErr w:type="spellEnd"/>
             <w:r>
               <w:rPr>
                 <w:i/>
                 <w:iCs/>
               </w:rPr>
-              <w:t>CacheBehavior.Throw</w:t>
-            </w:r>
-            <w:proofErr w:type="spellEnd"/>
+              <w:t>)], [</w:t>
+            </w:r>
+            <w:proofErr w:type="spellStart"/>
             <w:r>
               <w:rPr>
                 <w:i/>
                 <w:iCs/>
               </w:rPr>
-              <w:t xml:space="preserve">)], </w:t>
-            </w:r>
+              <w:t>CacheCondition</w:t>
+            </w:r>
+            <w:proofErr w:type="spellEnd"/>
             <w:r>
               <w:rPr>
                 <w:i/>
                 <w:iCs/>
               </w:rPr>
-              <w:lastRenderedPageBreak/>
-              <w:t>[</w:t>
-            </w:r>
-            <w:proofErr w:type="spellStart"/>
-            <w:proofErr w:type="gramStart"/>
+              <w:t>(</w:t>
+            </w:r>
+            <w:proofErr w:type="spellStart"/>
             <w:r>
               <w:rPr>
                 <w:i/>
                 <w:iCs/>
               </w:rPr>
-              <w:t>CacheCondition</w:t>
+              <w:t>CacheVaryBy.User</w:t>
             </w:r>
             <w:proofErr w:type="spellEnd"/>
             <w:r>
@@ -2661,153 +2782,151 @@
                 <w:i/>
                 <w:iCs/>
               </w:rPr>
-              <w:t>(</w:t>
-            </w:r>
-            <w:proofErr w:type="spellStart"/>
-            <w:proofErr w:type="gramEnd"/>
+              <w:t xml:space="preserve">)]) that cannot be safely cached and replayed. To fix this, configure the </w:t>
+            </w:r>
+            <w:proofErr w:type="spellStart"/>
             <w:r>
               <w:rPr>
                 <w:i/>
                 <w:iCs/>
               </w:rPr>
-              <w:t>CacheVaryBy.</w:t>
-            </w:r>
-            <w:proofErr w:type="gramStart"/>
+              <w:t>CacheView</w:t>
+            </w:r>
+            <w:proofErr w:type="spellEnd"/>
             <w:r>
               <w:rPr>
                 <w:i/>
                 <w:iCs/>
               </w:rPr>
-              <w:t>User</w:t>
-            </w:r>
-            <w:proofErr w:type="spellEnd"/>
+              <w:t xml:space="preserve"> to vary by User, or move the component outside the </w:t>
+            </w:r>
+            <w:proofErr w:type="spellStart"/>
             <w:r>
               <w:rPr>
                 <w:i/>
                 <w:iCs/>
               </w:rPr>
-              <w:t>)]</w:t>
-            </w:r>
-            <w:proofErr w:type="gramEnd"/>
+              <w:t>CacheView</w:t>
+            </w:r>
+            <w:proofErr w:type="spellEnd"/>
             <w:r>
               <w:rPr>
                 <w:i/>
                 <w:iCs/>
               </w:rPr>
-              <w:t xml:space="preserve">) that cannot be safely cached and replayed. To fix this, configure the </w:t>
-            </w:r>
-            <w:proofErr w:type="spellStart"/>
-            <w:r>
+              <w:t>.</w:t>
+            </w:r>
+          </w:p>
+        </w:tc>
+      </w:tr>
+      <w:tr>
+        <w:tc>
+          <w:tcPr>
+            <w:tcW w:w="1885" w:type="dxa"/>
+          </w:tcPr>
+          <w:p>
+            <w:pPr>
+              <w:spacing w:after="160" w:line="278" w:lineRule="auto"/>
+              <w:rPr>
+                <w:b/>
+                <w:bCs/>
+              </w:rPr>
+            </w:pPr>
+            <w:proofErr w:type="spellStart"/>
+            <w:r>
+              <w:rPr>
+                <w:b/>
+                <w:bCs/>
+              </w:rPr>
+              <w:t>QuickGrid</w:t>
+            </w:r>
+            <w:proofErr w:type="spellEnd"/>
+          </w:p>
+        </w:tc>
+        <w:tc>
+          <w:tcPr>
+            <w:tcW w:w="2970" w:type="dxa"/>
+          </w:tcPr>
+          <w:p>
+            <w:r>
+              <w:t xml:space="preserve">The exception clearly identified </w:t>
+            </w:r>
+            <w:proofErr w:type="spellStart"/>
+            <w:r>
+              <w:t>QuickGrid</w:t>
+            </w:r>
+            <w:proofErr w:type="spellEnd"/>
+            <w:r>
+              <w:t xml:space="preserve"> and instructed the developer to configure </w:t>
+            </w:r>
+            <w:proofErr w:type="spellStart"/>
+            <w:r>
+              <w:t>VaryByQuery</w:t>
+            </w:r>
+            <w:proofErr w:type="spellEnd"/>
+            <w:r>
+              <w:t xml:space="preserve"> or move the component outside the </w:t>
+            </w:r>
+            <w:proofErr w:type="spellStart"/>
+            <w:r>
+              <w:t>CacheView</w:t>
+            </w:r>
+            <w:proofErr w:type="spellEnd"/>
+            <w:r>
+              <w:t>. No source-code inspection was required.</w:t>
+            </w:r>
+          </w:p>
+        </w:tc>
+        <w:tc>
+          <w:tcPr>
+            <w:tcW w:w="4495" w:type="dxa"/>
+          </w:tcPr>
+          <w:p>
+            <w:pPr>
               <w:rPr>
                 <w:i/>
                 <w:iCs/>
               </w:rPr>
-              <w:t>CacheView</w:t>
-            </w:r>
-            <w:proofErr w:type="spellEnd"/>
+            </w:pPr>
+            <w:proofErr w:type="spellStart"/>
             <w:r>
               <w:rPr>
                 <w:i/>
                 <w:iCs/>
               </w:rPr>
-              <w:t xml:space="preserve"> to vary by User, or move the component outside the </w:t>
-            </w:r>
-            <w:proofErr w:type="spellStart"/>
+              <w:t>InvalidOperationException</w:t>
+            </w:r>
+            <w:proofErr w:type="spellEnd"/>
             <w:r>
               <w:rPr>
                 <w:i/>
                 <w:iCs/>
               </w:rPr>
-              <w:t>CacheView</w:t>
-            </w:r>
-            <w:proofErr w:type="spellEnd"/>
+              <w:t xml:space="preserve">: Component 'Microsoft.AspNetCore.Components.QuickGrid.QuickGrid`1[[CacheViewValidationSSR.Components.Pages.QuickGridRefusal+Product, </w:t>
+            </w:r>
+            <w:proofErr w:type="spellStart"/>
             <w:r>
               <w:rPr>
                 <w:i/>
                 <w:iCs/>
               </w:rPr>
-              <w:t>.</w:t>
-            </w:r>
-          </w:p>
-        </w:tc>
-      </w:tr>
-      <w:tr>
-        <w:tc>
-          <w:tcPr>
-            <w:tcW w:w="1885" w:type="dxa"/>
-          </w:tcPr>
-          <w:p>
-            <w:pPr>
-              <w:spacing w:after="160" w:line="278" w:lineRule="auto"/>
-              <w:rPr>
-                <w:b/>
-                <w:bCs/>
-              </w:rPr>
-            </w:pPr>
-            <w:proofErr w:type="spellStart"/>
-            <w:r>
-              <w:rPr>
-                <w:b/>
-                <w:bCs/>
-              </w:rPr>
-              <w:lastRenderedPageBreak/>
-              <w:t>QuickGrid</w:t>
-            </w:r>
-            <w:proofErr w:type="spellEnd"/>
-          </w:p>
-        </w:tc>
-        <w:tc>
-          <w:tcPr>
-            <w:tcW w:w="2970" w:type="dxa"/>
-          </w:tcPr>
-          <w:p>
-            <w:r>
-              <w:t xml:space="preserve">The exception clearly identified </w:t>
-            </w:r>
-            <w:proofErr w:type="spellStart"/>
-            <w:r>
-              <w:t>QuickGrid</w:t>
-            </w:r>
-            <w:proofErr w:type="spellEnd"/>
-            <w:r>
-              <w:t xml:space="preserve"> and instructed the developer to configure </w:t>
-            </w:r>
-            <w:proofErr w:type="spellStart"/>
-            <w:r>
-              <w:t>VaryByQuery</w:t>
-            </w:r>
-            <w:proofErr w:type="spellEnd"/>
-            <w:r>
-              <w:t xml:space="preserve"> or move the component outside the </w:t>
-            </w:r>
-            <w:proofErr w:type="spellStart"/>
-            <w:r>
-              <w:t>CacheView</w:t>
-            </w:r>
-            <w:proofErr w:type="spellEnd"/>
-            <w:r>
-              <w:t>. No source-code inspection was required.</w:t>
-            </w:r>
-          </w:p>
-        </w:tc>
-        <w:tc>
-          <w:tcPr>
-            <w:tcW w:w="4495" w:type="dxa"/>
-          </w:tcPr>
-          <w:p>
-            <w:pPr>
+              <w:t>CacheViewValidationSSR</w:t>
+            </w:r>
+            <w:proofErr w:type="spellEnd"/>
+            <w:r>
               <w:rPr>
                 <w:i/>
                 <w:iCs/>
               </w:rPr>
-            </w:pPr>
+              <w:t xml:space="preserve">, Version=1.0.0.0, Culture=neutral, </w:t>
+            </w:r>
             <w:proofErr w:type="spellStart"/>
             <w:r>
               <w:rPr>
                 <w:i/>
                 <w:iCs/>
               </w:rPr>
-              <w:t>InvalidOperationException</w:t>
+              <w:t>PublicKeyToken</w:t>
             </w:r>
             <w:proofErr w:type="spellEnd"/>
             <w:r>
@@ -2815,39 +2934,39 @@
                 <w:i/>
                 <w:iCs/>
               </w:rPr>
-              <w:t>: Component '</w:t>
-            </w:r>
-            <w:proofErr w:type="gramStart"/>
+              <w:t xml:space="preserve">=null]]' cannot be used inside a </w:t>
+            </w:r>
+            <w:proofErr w:type="spellStart"/>
             <w:r>
               <w:rPr>
                 <w:i/>
                 <w:iCs/>
               </w:rPr>
-              <w:t>Microsoft.AspNetCore.Components.QuickGrid</w:t>
-            </w:r>
-            <w:proofErr w:type="gramEnd"/>
+              <w:t>CacheView</w:t>
+            </w:r>
+            <w:proofErr w:type="spellEnd"/>
             <w:r>
               <w:rPr>
                 <w:i/>
                 <w:iCs/>
               </w:rPr>
-              <w:t>.QuickGrid`1[[</w:t>
-            </w:r>
-            <w:proofErr w:type="gramStart"/>
+              <w:t xml:space="preserve"> because its output depends on per-request state ([</w:t>
+            </w:r>
+            <w:proofErr w:type="spellStart"/>
             <w:r>
               <w:rPr>
                 <w:i/>
                 <w:iCs/>
               </w:rPr>
-              <w:t>CacheViewValidationSSR.Components.Pages.QuickGridRefusal</w:t>
-            </w:r>
-            <w:proofErr w:type="gramEnd"/>
+              <w:t>CacheBehavior</w:t>
+            </w:r>
+            <w:proofErr w:type="spellEnd"/>
             <w:r>
               <w:rPr>
                 <w:i/>
                 <w:iCs/>
               </w:rPr>
-              <w:t xml:space="preserve">+Product, </w:t>
+              <w:t>(</w:t>
             </w:r>
             <w:proofErr w:type="spellStart"/>
             <w:r>
@@ -2855,7 +2974,7 @@
                 <w:i/>
                 <w:iCs/>
               </w:rPr>
-              <w:t>CacheViewValidationSSR</w:t>
+              <w:t>CacheBehavior.Throw</w:t>
             </w:r>
             <w:proofErr w:type="spellEnd"/>
             <w:r>
@@ -2863,7 +2982,7 @@
                 <w:i/>
                 <w:iCs/>
               </w:rPr>
-              <w:t xml:space="preserve">, Version=1.0.0.0, Culture=neutral, </w:t>
+              <w:t>)], [</w:t>
             </w:r>
             <w:proofErr w:type="spellStart"/>
             <w:r>
@@ -2871,7 +2990,7 @@
                 <w:i/>
                 <w:iCs/>
               </w:rPr>
-              <w:t>PublicKeyToken</w:t>
+              <w:t>CacheCondition</w:t>
             </w:r>
             <w:proofErr w:type="spellEnd"/>
             <w:r>
@@ -2879,77 +2998,9 @@
                 <w:i/>
                 <w:iCs/>
               </w:rPr>
-              <w:t xml:space="preserve">=null]]' cannot be used inside a </w:t>
-            </w:r>
-            <w:proofErr w:type="spellStart"/>
-            <w:r>
-              <w:rPr>
-                <w:i/>
-                <w:iCs/>
-              </w:rPr>
-              <w:t>CacheView</w:t>
-            </w:r>
-            <w:proofErr w:type="spellEnd"/>
-            <w:r>
-              <w:rPr>
-                <w:i/>
-                <w:iCs/>
-              </w:rPr>
-              <w:t xml:space="preserve"> because its output depends on per-request state ([</w:t>
-            </w:r>
-            <w:proofErr w:type="spellStart"/>
-            <w:proofErr w:type="gramStart"/>
-            <w:r>
-              <w:rPr>
-                <w:i/>
-                <w:iCs/>
-              </w:rPr>
-              <w:t>CacheBehavior</w:t>
-            </w:r>
-            <w:proofErr w:type="spellEnd"/>
-            <w:r>
-              <w:rPr>
-                <w:i/>
-                <w:iCs/>
-              </w:rPr>
               <w:t>(</w:t>
             </w:r>
             <w:proofErr w:type="spellStart"/>
-            <w:proofErr w:type="gramEnd"/>
-            <w:r>
-              <w:rPr>
-                <w:i/>
-                <w:iCs/>
-              </w:rPr>
-              <w:t>CacheBehavior.Throw</w:t>
-            </w:r>
-            <w:proofErr w:type="spellEnd"/>
-            <w:r>
-              <w:rPr>
-                <w:i/>
-                <w:iCs/>
-              </w:rPr>
-              <w:t>)], [</w:t>
-            </w:r>
-            <w:proofErr w:type="spellStart"/>
-            <w:proofErr w:type="gramStart"/>
-            <w:r>
-              <w:rPr>
-                <w:i/>
-                <w:iCs/>
-              </w:rPr>
-              <w:t>CacheCondition</w:t>
-            </w:r>
-            <w:proofErr w:type="spellEnd"/>
-            <w:r>
-              <w:rPr>
-                <w:i/>
-                <w:iCs/>
-              </w:rPr>
-              <w:t>(</w:t>
-            </w:r>
-            <w:proofErr w:type="spellStart"/>
-            <w:proofErr w:type="gramEnd"/>
             <w:r>
               <w:rPr>
                 <w:i/>
@@ -3087,7 +3138,6 @@
               <w:t>: Component '</w:t>
             </w:r>
             <w:proofErr w:type="spellStart"/>
-            <w:proofErr w:type="gramStart"/>
             <w:r>
               <w:rPr>
                 <w:i/>
@@ -3096,7 +3146,6 @@
               <w:t>CacheViewValidationComponents.Components.UserBadge</w:t>
             </w:r>
             <w:proofErr w:type="spellEnd"/>
-            <w:proofErr w:type="gramEnd"/>
             <w:r>
               <w:rPr>
                 <w:i/>
@@ -3121,7 +3170,6 @@
               <w:t xml:space="preserve"> because its output depends on per-request state ([</w:t>
             </w:r>
             <w:proofErr w:type="spellStart"/>
-            <w:proofErr w:type="gramStart"/>
             <w:r>
               <w:rPr>
                 <w:i/>
@@ -3138,7 +3186,6 @@
               <w:t>(</w:t>
             </w:r>
             <w:proofErr w:type="spellStart"/>
-            <w:proofErr w:type="gramEnd"/>
             <w:r>
               <w:rPr>
                 <w:i/>
@@ -3152,38 +3199,22 @@
                 <w:i/>
                 <w:iCs/>
               </w:rPr>
-              <w:t xml:space="preserve">)]) that cannot be safely </w:t>
-            </w:r>
-            <w:proofErr w:type="gramStart"/>
+              <w:t xml:space="preserve">)]) that cannot be safely cached and replayed. To fix this, move the component outside the </w:t>
+            </w:r>
+            <w:proofErr w:type="spellStart"/>
             <w:r>
               <w:rPr>
                 <w:i/>
                 <w:iCs/>
               </w:rPr>
-              <w:t>cached</w:t>
-            </w:r>
-            <w:proofErr w:type="gramEnd"/>
+              <w:t>CacheView</w:t>
+            </w:r>
+            <w:proofErr w:type="spellEnd"/>
             <w:r>
               <w:rPr>
                 <w:i/>
                 <w:iCs/>
               </w:rPr>
-              <w:t xml:space="preserve"> and replayed. To fix this, move the component outside the </w:t>
-            </w:r>
-            <w:proofErr w:type="spellStart"/>
-            <w:r>
-              <w:rPr>
-                <w:i/>
-                <w:iCs/>
-              </w:rPr>
-              <w:t>CacheView</w:t>
-            </w:r>
-            <w:proofErr w:type="spellEnd"/>
-            <w:r>
-              <w:rPr>
-                <w:i/>
-                <w:iCs/>
-              </w:rPr>
               <w:t>.</w:t>
             </w:r>
           </w:p>
@@ -3207,6 +3238,7 @@
                 <w:b/>
                 <w:bCs/>
               </w:rPr>
+              <w:lastRenderedPageBreak/>
               <w:t xml:space="preserve">Nested </w:t>
             </w:r>
             <w:proofErr w:type="spellStart"/>
@@ -3366,37 +3398,1214 @@
           <w:szCs w:val="32"/>
         </w:rPr>
       </w:pPr>
-      <w:r>
+    </w:p>
+    <w:p>
+      <w:pPr>
         <w:rPr>
           <w:b/>
           <w:bCs/>
           <w:sz w:val="32"/>
           <w:szCs w:val="32"/>
         </w:rPr>
-        <w:lastRenderedPageBreak/>
-        <w:t>Documentation Assessment</w:t>
+      </w:pPr>
+      <w:proofErr w:type="spellStart"/>
+      <w:r>
+        <w:rPr>
+          <w:b/>
+          <w:bCs/>
+          <w:sz w:val="32"/>
+          <w:szCs w:val="32"/>
+        </w:rPr>
+        <w:t>QuickGrid</w:t>
+      </w:r>
+      <w:proofErr w:type="spellEnd"/>
+      <w:r>
+        <w:rPr>
+          <w:b/>
+          <w:bCs/>
+          <w:sz w:val="32"/>
+          <w:szCs w:val="32"/>
+        </w:rPr>
+        <w:t xml:space="preserve"> sorting </w:t>
       </w:r>
     </w:p>
     <w:p>
       <w:pPr>
+        <w:ind w:left="720"/>
+      </w:pPr>
+      <w:r>
         <w:rPr>
           <w:b/>
           <w:bCs/>
         </w:rPr>
-      </w:pPr>
-      <w:r>
+        <w:t>Initial URL:</w:t>
+      </w:r>
+      <w:r>
+        <w:t xml:space="preserve"> </w:t>
+      </w:r>
+      <w:r>
+        <w:t>http://localhost:5054/quickgrid/fixed</w:t>
+      </w:r>
+    </w:p>
+    <w:p>
+      <w:pPr>
+        <w:ind w:left="720"/>
         <w:rPr>
           <w:b/>
           <w:bCs/>
         </w:rPr>
-        <w:t>Reviewed Documentation:</w:t>
+      </w:pPr>
+      <w:r>
+        <w:rPr>
+          <w:b/>
+          <w:bCs/>
+        </w:rPr>
+        <w:t>Initial Order:</w:t>
+      </w:r>
+      <w:r>
+        <w:rPr>
+          <w:b/>
+          <w:bCs/>
+        </w:rPr>
+        <w:t xml:space="preserve"> </w:t>
       </w:r>
     </w:p>
     <w:p>
-      <w:r>
-        <w:t xml:space="preserve">- </w:t>
-      </w:r>
-      <w:hyperlink r:id="rId24" w:history="1">
+      <w:pPr>
+        <w:ind w:left="720"/>
+        <w:rPr>
+          <w:b/>
+          <w:bCs/>
+        </w:rPr>
+      </w:pPr>
+      <w:r>
+        <w:rPr>
+          <w:b/>
+          <w:bCs/>
+        </w:rPr>
+        <w:drawing>
+          <wp:inline distT="0" distB="0" distL="0" distR="0" wp14:anchorId="19147AEE" wp14:editId="721D260D">
+            <wp:extent cx="3642360" cy="1755804"/>
+            <wp:effectExtent l="0" t="0" r="0" b="0"/>
+            <wp:docPr id="671799467" name="Picture 1"/>
+            <wp:cNvGraphicFramePr>
+              <a:graphicFrameLocks xmlns:a="http://schemas.openxmlformats.org/drawingml/2006/main" noChangeAspect="1"/>
+            </wp:cNvGraphicFramePr>
+            <a:graphic xmlns:a="http://schemas.openxmlformats.org/drawingml/2006/main">
+              <a:graphicData uri="http://schemas.openxmlformats.org/drawingml/2006/picture">
+                <pic:pic xmlns:pic="http://schemas.openxmlformats.org/drawingml/2006/picture">
+                  <pic:nvPicPr>
+                    <pic:cNvPr id="671799467" name=""/>
+                    <pic:cNvPicPr/>
+                  </pic:nvPicPr>
+                  <pic:blipFill>
+                    <a:blip r:embed="rId26"/>
+                    <a:stretch>
+                      <a:fillRect/>
+                    </a:stretch>
+                  </pic:blipFill>
+                  <pic:spPr>
+                    <a:xfrm>
+                      <a:off x="0" y="0"/>
+                      <a:ext cx="3714022" cy="1790349"/>
+                    </a:xfrm>
+                    <a:prstGeom prst="rect">
+                      <a:avLst/>
+                    </a:prstGeom>
+                  </pic:spPr>
+                </pic:pic>
+              </a:graphicData>
+            </a:graphic>
+          </wp:inline>
+        </w:drawing>
+      </w:r>
+    </w:p>
+    <w:p>
+      <w:pPr>
+        <w:ind w:left="720"/>
+      </w:pPr>
+      <w:r>
+        <w:rPr>
+          <w:b/>
+          <w:bCs/>
+        </w:rPr>
+        <w:t>Sorted URL:</w:t>
+      </w:r>
+      <w:r>
+        <w:rPr>
+          <w:b/>
+          <w:bCs/>
+        </w:rPr>
+        <w:t xml:space="preserve"> </w:t>
+      </w:r>
+      <w:r>
+        <w:t>http://localhost:5054/quickgrid/fixed?sort=Name&amp;direction=desc</w:t>
+      </w:r>
+    </w:p>
+    <w:p>
+      <w:pPr>
+        <w:ind w:left="720"/>
+        <w:rPr>
+          <w:b/>
+          <w:bCs/>
+        </w:rPr>
+      </w:pPr>
+      <w:r>
+        <w:rPr>
+          <w:b/>
+          <w:bCs/>
+        </w:rPr>
+        <w:t>Sorted Order:</w:t>
+      </w:r>
+    </w:p>
+    <w:p>
+      <w:pPr>
+        <w:ind w:left="720"/>
+        <w:rPr>
+          <w:b/>
+          <w:bCs/>
+        </w:rPr>
+      </w:pPr>
+      <w:r>
+        <w:rPr>
+          <w:b/>
+          <w:bCs/>
+        </w:rPr>
+        <w:drawing>
+          <wp:inline distT="0" distB="0" distL="0" distR="0" wp14:anchorId="71421549" wp14:editId="37ED146C">
+            <wp:extent cx="3634740" cy="2030952"/>
+            <wp:effectExtent l="0" t="0" r="3810" b="7620"/>
+            <wp:docPr id="1694553271" name="Picture 1"/>
+            <wp:cNvGraphicFramePr>
+              <a:graphicFrameLocks xmlns:a="http://schemas.openxmlformats.org/drawingml/2006/main" noChangeAspect="1"/>
+            </wp:cNvGraphicFramePr>
+            <a:graphic xmlns:a="http://schemas.openxmlformats.org/drawingml/2006/main">
+              <a:graphicData uri="http://schemas.openxmlformats.org/drawingml/2006/picture">
+                <pic:pic xmlns:pic="http://schemas.openxmlformats.org/drawingml/2006/picture">
+                  <pic:nvPicPr>
+                    <pic:cNvPr id="1694553271" name=""/>
+                    <pic:cNvPicPr/>
+                  </pic:nvPicPr>
+                  <pic:blipFill>
+                    <a:blip r:embed="rId27"/>
+                    <a:stretch>
+                      <a:fillRect/>
+                    </a:stretch>
+                  </pic:blipFill>
+                  <pic:spPr>
+                    <a:xfrm>
+                      <a:off x="0" y="0"/>
+                      <a:ext cx="3691760" cy="2062812"/>
+                    </a:xfrm>
+                    <a:prstGeom prst="rect">
+                      <a:avLst/>
+                    </a:prstGeom>
+                  </pic:spPr>
+                </pic:pic>
+              </a:graphicData>
+            </a:graphic>
+          </wp:inline>
+        </w:drawing>
+      </w:r>
+    </w:p>
+    <w:p>
+      <w:pPr>
+        <w:rPr>
+          <w:b/>
+          <w:bCs/>
+          <w:sz w:val="32"/>
+          <w:szCs w:val="32"/>
+        </w:rPr>
+      </w:pPr>
+      <w:proofErr w:type="spellStart"/>
+      <w:r>
+        <w:rPr>
+          <w:b/>
+          <w:bCs/>
+          <w:sz w:val="32"/>
+          <w:szCs w:val="32"/>
+        </w:rPr>
+        <w:lastRenderedPageBreak/>
+        <w:t>PricePanel</w:t>
+      </w:r>
+      <w:proofErr w:type="spellEnd"/>
+      <w:r>
+        <w:rPr>
+          <w:b/>
+          <w:bCs/>
+          <w:sz w:val="32"/>
+          <w:szCs w:val="32"/>
+        </w:rPr>
+        <w:t xml:space="preserve"> comparisons</w:t>
+      </w:r>
+    </w:p>
+    <w:tbl>
+      <w:tblPr>
+        <w:tblStyle w:val="TableGrid"/>
+        <w:tblW w:w="9625" w:type="dxa"/>
+        <w:tblLayout w:type="fixed"/>
+        <w:tblLook w:val="04A0" w:firstRow="1" w:lastRow="0" w:firstColumn="1" w:lastColumn="0" w:noHBand="0" w:noVBand="1"/>
+      </w:tblPr>
+      <w:tblGrid>
+        <w:gridCol w:w="1795"/>
+        <w:gridCol w:w="1170"/>
+        <w:gridCol w:w="1170"/>
+        <w:gridCol w:w="1306"/>
+        <w:gridCol w:w="1304"/>
+        <w:gridCol w:w="1620"/>
+        <w:gridCol w:w="1260"/>
+      </w:tblGrid>
+      <w:tr>
+        <w:tc>
+          <w:tcPr>
+            <w:tcW w:w="1795" w:type="dxa"/>
+            <w:hideMark/>
+          </w:tcPr>
+          <w:p>
+            <w:pPr>
+              <w:spacing w:after="160" w:line="278" w:lineRule="auto"/>
+              <w:jc w:val="center"/>
+              <w:rPr>
+                <w:b/>
+                <w:bCs/>
+              </w:rPr>
+            </w:pPr>
+            <w:r>
+              <w:rPr>
+                <w:b/>
+                <w:bCs/>
+              </w:rPr>
+              <w:t>Configuration</w:t>
+            </w:r>
+          </w:p>
+        </w:tc>
+        <w:tc>
+          <w:tcPr>
+            <w:tcW w:w="1170" w:type="dxa"/>
+            <w:hideMark/>
+          </w:tcPr>
+          <w:p>
+            <w:pPr>
+              <w:spacing w:after="160" w:line="278" w:lineRule="auto"/>
+              <w:jc w:val="center"/>
+              <w:rPr>
+                <w:b/>
+                <w:bCs/>
+              </w:rPr>
+            </w:pPr>
+            <w:r>
+              <w:rPr>
+                <w:b/>
+                <w:bCs/>
+              </w:rPr>
+              <w:t>Request</w:t>
+            </w:r>
+          </w:p>
+        </w:tc>
+        <w:tc>
+          <w:tcPr>
+            <w:tcW w:w="1170" w:type="dxa"/>
+            <w:hideMark/>
+          </w:tcPr>
+          <w:p>
+            <w:pPr>
+              <w:spacing w:after="160" w:line="278" w:lineRule="auto"/>
+              <w:jc w:val="center"/>
+              <w:rPr>
+                <w:b/>
+                <w:bCs/>
+              </w:rPr>
+            </w:pPr>
+            <w:r>
+              <w:rPr>
+                <w:b/>
+                <w:bCs/>
+              </w:rPr>
+              <w:t>Cookie Value</w:t>
+            </w:r>
+          </w:p>
+        </w:tc>
+        <w:tc>
+          <w:tcPr>
+            <w:tcW w:w="1306" w:type="dxa"/>
+            <w:hideMark/>
+          </w:tcPr>
+          <w:p>
+            <w:pPr>
+              <w:spacing w:after="160" w:line="278" w:lineRule="auto"/>
+              <w:jc w:val="center"/>
+              <w:rPr>
+                <w:b/>
+                <w:bCs/>
+              </w:rPr>
+            </w:pPr>
+            <w:r>
+              <w:rPr>
+                <w:b/>
+                <w:bCs/>
+              </w:rPr>
+              <w:t>Cache-entry ID</w:t>
+            </w:r>
+          </w:p>
+        </w:tc>
+        <w:tc>
+          <w:tcPr>
+            <w:tcW w:w="1304" w:type="dxa"/>
+            <w:hideMark/>
+          </w:tcPr>
+          <w:p>
+            <w:pPr>
+              <w:spacing w:after="160" w:line="278" w:lineRule="auto"/>
+              <w:jc w:val="center"/>
+              <w:rPr>
+                <w:b/>
+                <w:bCs/>
+              </w:rPr>
+            </w:pPr>
+            <w:r>
+              <w:rPr>
+                <w:b/>
+                <w:bCs/>
+              </w:rPr>
+              <w:t>Lifecycle ID</w:t>
+            </w:r>
+          </w:p>
+        </w:tc>
+        <w:tc>
+          <w:tcPr>
+            <w:tcW w:w="1620" w:type="dxa"/>
+            <w:hideMark/>
+          </w:tcPr>
+          <w:p>
+            <w:pPr>
+              <w:spacing w:after="160" w:line="278" w:lineRule="auto"/>
+              <w:jc w:val="center"/>
+              <w:rPr>
+                <w:b/>
+                <w:bCs/>
+              </w:rPr>
+            </w:pPr>
+            <w:r>
+              <w:rPr>
+                <w:b/>
+                <w:bCs/>
+              </w:rPr>
+              <w:t>Comparison</w:t>
+            </w:r>
+          </w:p>
+        </w:tc>
+        <w:tc>
+          <w:tcPr>
+            <w:tcW w:w="1260" w:type="dxa"/>
+            <w:hideMark/>
+          </w:tcPr>
+          <w:p>
+            <w:pPr>
+              <w:spacing w:after="160" w:line="278" w:lineRule="auto"/>
+              <w:jc w:val="center"/>
+              <w:rPr>
+                <w:b/>
+                <w:bCs/>
+              </w:rPr>
+            </w:pPr>
+            <w:r>
+              <w:rPr>
+                <w:b/>
+                <w:bCs/>
+              </w:rPr>
+              <w:t>Result</w:t>
+            </w:r>
+          </w:p>
+        </w:tc>
+      </w:tr>
+      <w:tr>
+        <w:tc>
+          <w:tcPr>
+            <w:tcW w:w="1795" w:type="dxa"/>
+            <w:hideMark/>
+          </w:tcPr>
+          <w:p>
+            <w:pPr>
+              <w:spacing w:after="160" w:line="278" w:lineRule="auto"/>
+            </w:pPr>
+            <w:r>
+              <w:t xml:space="preserve">Live (No </w:t>
+            </w:r>
+            <w:proofErr w:type="spellStart"/>
+            <w:r>
+              <w:t>VaryByCookie</w:t>
+            </w:r>
+            <w:proofErr w:type="spellEnd"/>
+            <w:r>
+              <w:t>)</w:t>
+            </w:r>
+          </w:p>
+        </w:tc>
+        <w:tc>
+          <w:tcPr>
+            <w:tcW w:w="1170" w:type="dxa"/>
+            <w:hideMark/>
+          </w:tcPr>
+          <w:p>
+            <w:pPr>
+              <w:spacing w:after="160" w:line="278" w:lineRule="auto"/>
+            </w:pPr>
+            <w:r>
+              <w:t>1 (Cold)</w:t>
+            </w:r>
+          </w:p>
+        </w:tc>
+        <w:tc>
+          <w:tcPr>
+            <w:tcW w:w="1170" w:type="dxa"/>
+            <w:hideMark/>
+          </w:tcPr>
+          <w:p>
+            <w:pPr>
+              <w:spacing w:after="160" w:line="278" w:lineRule="auto"/>
+            </w:pPr>
+            <w:r>
+              <w:t>standard</w:t>
+            </w:r>
+          </w:p>
+        </w:tc>
+        <w:tc>
+          <w:tcPr>
+            <w:tcW w:w="1306" w:type="dxa"/>
+            <w:hideMark/>
+          </w:tcPr>
+          <w:p>
+            <w:pPr>
+              <w:spacing w:after="160" w:line="278" w:lineRule="auto"/>
+            </w:pPr>
+            <w:r>
+              <w:t>83797d36-f45c-4e0f-8059-af0f36cca5b0</w:t>
+            </w:r>
+          </w:p>
+        </w:tc>
+        <w:tc>
+          <w:tcPr>
+            <w:tcW w:w="1304" w:type="dxa"/>
+            <w:hideMark/>
+          </w:tcPr>
+          <w:p>
+            <w:pPr>
+              <w:spacing w:after="160" w:line="278" w:lineRule="auto"/>
+            </w:pPr>
+            <w:r>
+              <w:t>b162f97e-e86f-42b8-9c17-6d4f1f19c504</w:t>
+            </w:r>
+          </w:p>
+        </w:tc>
+        <w:tc>
+          <w:tcPr>
+            <w:tcW w:w="1620" w:type="dxa"/>
+            <w:hideMark/>
+          </w:tcPr>
+          <w:p>
+            <w:pPr>
+              <w:spacing w:after="160" w:line="278" w:lineRule="auto"/>
+            </w:pPr>
+            <w:r>
+              <w:t>Baseline request. Cache entry and lifecycle identifiers are recorded.</w:t>
+            </w:r>
+          </w:p>
+        </w:tc>
+        <w:tc>
+          <w:tcPr>
+            <w:tcW w:w="1260" w:type="dxa"/>
+            <w:hideMark/>
+          </w:tcPr>
+          <w:p>
+            <w:pPr>
+              <w:spacing w:after="160" w:line="278" w:lineRule="auto"/>
+            </w:pPr>
+            <w:r>
+              <w:t>Initial render</w:t>
+            </w:r>
+          </w:p>
+        </w:tc>
+      </w:tr>
+      <w:tr>
+        <w:tc>
+          <w:tcPr>
+            <w:tcW w:w="1795" w:type="dxa"/>
+            <w:hideMark/>
+          </w:tcPr>
+          <w:p>
+            <w:pPr>
+              <w:spacing w:after="160" w:line="278" w:lineRule="auto"/>
+            </w:pPr>
+            <w:r>
+              <w:t xml:space="preserve">Live (No </w:t>
+            </w:r>
+            <w:proofErr w:type="spellStart"/>
+            <w:r>
+              <w:t>VaryByCookie</w:t>
+            </w:r>
+            <w:proofErr w:type="spellEnd"/>
+            <w:r>
+              <w:t>)</w:t>
+            </w:r>
+          </w:p>
+        </w:tc>
+        <w:tc>
+          <w:tcPr>
+            <w:tcW w:w="1170" w:type="dxa"/>
+            <w:hideMark/>
+          </w:tcPr>
+          <w:p>
+            <w:pPr>
+              <w:spacing w:after="160" w:line="278" w:lineRule="auto"/>
+            </w:pPr>
+            <w:r>
+              <w:t>2 (Refresh)</w:t>
+            </w:r>
+          </w:p>
+        </w:tc>
+        <w:tc>
+          <w:tcPr>
+            <w:tcW w:w="1170" w:type="dxa"/>
+            <w:hideMark/>
+          </w:tcPr>
+          <w:p>
+            <w:pPr>
+              <w:spacing w:after="160" w:line="278" w:lineRule="auto"/>
+            </w:pPr>
+            <w:r>
+              <w:t>standard</w:t>
+            </w:r>
+          </w:p>
+        </w:tc>
+        <w:tc>
+          <w:tcPr>
+            <w:tcW w:w="1306" w:type="dxa"/>
+            <w:hideMark/>
+          </w:tcPr>
+          <w:p>
+            <w:pPr>
+              <w:spacing w:after="160" w:line="278" w:lineRule="auto"/>
+            </w:pPr>
+            <w:r>
+              <w:t>83797d36-f45c-4e0f-8059-af0f36cca5b0</w:t>
+            </w:r>
+          </w:p>
+        </w:tc>
+        <w:tc>
+          <w:tcPr>
+            <w:tcW w:w="1304" w:type="dxa"/>
+            <w:hideMark/>
+          </w:tcPr>
+          <w:p>
+            <w:pPr>
+              <w:spacing w:after="160" w:line="278" w:lineRule="auto"/>
+            </w:pPr>
+            <w:r>
+              <w:t>2e56b30f-8de4-4efb-bc2c-299387ab914c</w:t>
+            </w:r>
+          </w:p>
+        </w:tc>
+        <w:tc>
+          <w:tcPr>
+            <w:tcW w:w="1620" w:type="dxa"/>
+            <w:hideMark/>
+          </w:tcPr>
+          <w:p>
+            <w:pPr>
+              <w:spacing w:after="160" w:line="278" w:lineRule="auto"/>
+            </w:pPr>
+            <w:r>
+              <w:t>Cache-entry ID remains the same</w:t>
+            </w:r>
+            <w:r>
+              <w:t>,</w:t>
+            </w:r>
+            <w:r>
+              <w:t xml:space="preserve"> Lifecycle ID changes</w:t>
+            </w:r>
+            <w:r>
+              <w:t>.</w:t>
+            </w:r>
+            <w:r>
+              <w:t xml:space="preserve"> </w:t>
+            </w:r>
+          </w:p>
+        </w:tc>
+        <w:tc>
+          <w:tcPr>
+            <w:tcW w:w="1260" w:type="dxa"/>
+            <w:hideMark/>
+          </w:tcPr>
+          <w:p>
+            <w:pPr>
+              <w:spacing w:after="160" w:line="278" w:lineRule="auto"/>
+            </w:pPr>
+            <w:r>
+              <w:rPr>
+                <w:b/>
+                <w:bCs/>
+              </w:rPr>
+              <w:t>Pass</w:t>
+            </w:r>
+            <w:r>
+              <w:rPr>
+                <w:b/>
+                <w:bCs/>
+              </w:rPr>
+              <w:t xml:space="preserve"> </w:t>
+            </w:r>
+            <w:r>
+              <w:t>(</w:t>
+            </w:r>
+            <w:r>
+              <w:t>Confirms live re</w:t>
+            </w:r>
+            <w:r>
+              <w:t>-</w:t>
+            </w:r>
+            <w:r>
+              <w:t>rendering within</w:t>
+            </w:r>
+            <w:r>
+              <w:t xml:space="preserve"> </w:t>
+            </w:r>
+            <w:r>
+              <w:t>cached section.</w:t>
+            </w:r>
+            <w:r>
+              <w:t>)</w:t>
+            </w:r>
+          </w:p>
+        </w:tc>
+      </w:tr>
+      <w:tr>
+        <w:tc>
+          <w:tcPr>
+            <w:tcW w:w="1795" w:type="dxa"/>
+            <w:hideMark/>
+          </w:tcPr>
+          <w:p>
+            <w:pPr>
+              <w:spacing w:after="160" w:line="278" w:lineRule="auto"/>
+            </w:pPr>
+            <w:r>
+              <w:t>Cached (</w:t>
+            </w:r>
+            <w:proofErr w:type="spellStart"/>
+            <w:r>
+              <w:t>VaryByCookie</w:t>
+            </w:r>
+            <w:proofErr w:type="spellEnd"/>
+            <w:r>
+              <w:t>="price-selection")</w:t>
+            </w:r>
+          </w:p>
+        </w:tc>
+        <w:tc>
+          <w:tcPr>
+            <w:tcW w:w="1170" w:type="dxa"/>
+            <w:hideMark/>
+          </w:tcPr>
+          <w:p>
+            <w:pPr>
+              <w:spacing w:after="160" w:line="278" w:lineRule="auto"/>
+            </w:pPr>
+            <w:r>
+              <w:t>1 (Cold)</w:t>
+            </w:r>
+          </w:p>
+        </w:tc>
+        <w:tc>
+          <w:tcPr>
+            <w:tcW w:w="1170" w:type="dxa"/>
+            <w:hideMark/>
+          </w:tcPr>
+          <w:p>
+            <w:pPr>
+              <w:spacing w:after="160" w:line="278" w:lineRule="auto"/>
+            </w:pPr>
+            <w:r>
+              <w:t>standard</w:t>
+            </w:r>
+          </w:p>
+        </w:tc>
+        <w:tc>
+          <w:tcPr>
+            <w:tcW w:w="1306" w:type="dxa"/>
+            <w:hideMark/>
+          </w:tcPr>
+          <w:p>
+            <w:pPr>
+              <w:spacing w:after="160" w:line="278" w:lineRule="auto"/>
+            </w:pPr>
+            <w:r>
+              <w:t>b8c30184-eca3-4a1d-a6d3-28d6681d216d</w:t>
+            </w:r>
+          </w:p>
+        </w:tc>
+        <w:tc>
+          <w:tcPr>
+            <w:tcW w:w="1304" w:type="dxa"/>
+            <w:hideMark/>
+          </w:tcPr>
+          <w:p>
+            <w:pPr>
+              <w:spacing w:after="160" w:line="278" w:lineRule="auto"/>
+            </w:pPr>
+            <w:r>
+              <w:t>addb71a7-07ca-4f27-a00a-200c0ff2fbf6</w:t>
+            </w:r>
+          </w:p>
+        </w:tc>
+        <w:tc>
+          <w:tcPr>
+            <w:tcW w:w="1620" w:type="dxa"/>
+            <w:hideMark/>
+          </w:tcPr>
+          <w:p>
+            <w:pPr>
+              <w:spacing w:after="160" w:line="278" w:lineRule="auto"/>
+            </w:pPr>
+            <w:r>
+              <w:t>Baseline request for standard pricing cache entry.</w:t>
+            </w:r>
+          </w:p>
+        </w:tc>
+        <w:tc>
+          <w:tcPr>
+            <w:tcW w:w="1260" w:type="dxa"/>
+            <w:hideMark/>
+          </w:tcPr>
+          <w:p>
+            <w:pPr>
+              <w:spacing w:after="160" w:line="278" w:lineRule="auto"/>
+            </w:pPr>
+            <w:r>
+              <w:t>Initial render</w:t>
+            </w:r>
+          </w:p>
+        </w:tc>
+      </w:tr>
+      <w:tr>
+        <w:tc>
+          <w:tcPr>
+            <w:tcW w:w="1795" w:type="dxa"/>
+            <w:hideMark/>
+          </w:tcPr>
+          <w:p>
+            <w:pPr>
+              <w:spacing w:after="160" w:line="278" w:lineRule="auto"/>
+            </w:pPr>
+            <w:r>
+              <w:t>Cached (</w:t>
+            </w:r>
+            <w:proofErr w:type="spellStart"/>
+            <w:r>
+              <w:t>VaryByCookie</w:t>
+            </w:r>
+            <w:proofErr w:type="spellEnd"/>
+            <w:r>
+              <w:t>="price-selection")</w:t>
+            </w:r>
+          </w:p>
+        </w:tc>
+        <w:tc>
+          <w:tcPr>
+            <w:tcW w:w="1170" w:type="dxa"/>
+            <w:hideMark/>
+          </w:tcPr>
+          <w:p>
+            <w:pPr>
+              <w:spacing w:after="160" w:line="278" w:lineRule="auto"/>
+            </w:pPr>
+            <w:r>
+              <w:t>2 (Refresh)</w:t>
+            </w:r>
+          </w:p>
+        </w:tc>
+        <w:tc>
+          <w:tcPr>
+            <w:tcW w:w="1170" w:type="dxa"/>
+            <w:hideMark/>
+          </w:tcPr>
+          <w:p>
+            <w:pPr>
+              <w:spacing w:after="160" w:line="278" w:lineRule="auto"/>
+            </w:pPr>
+            <w:r>
+              <w:t>standard</w:t>
+            </w:r>
+          </w:p>
+        </w:tc>
+        <w:tc>
+          <w:tcPr>
+            <w:tcW w:w="1306" w:type="dxa"/>
+            <w:hideMark/>
+          </w:tcPr>
+          <w:p>
+            <w:pPr>
+              <w:spacing w:after="160" w:line="278" w:lineRule="auto"/>
+            </w:pPr>
+            <w:r>
+              <w:t>b8c30184-eca3-4a1d-a6d3-28d6681d216d</w:t>
+            </w:r>
+          </w:p>
+        </w:tc>
+        <w:tc>
+          <w:tcPr>
+            <w:tcW w:w="1304" w:type="dxa"/>
+            <w:hideMark/>
+          </w:tcPr>
+          <w:p>
+            <w:pPr>
+              <w:spacing w:after="160" w:line="278" w:lineRule="auto"/>
+            </w:pPr>
+            <w:r>
+              <w:t>addb71a7-07ca-4f27-a00a-200c0ff2fbf6</w:t>
+            </w:r>
+          </w:p>
+        </w:tc>
+        <w:tc>
+          <w:tcPr>
+            <w:tcW w:w="1620" w:type="dxa"/>
+            <w:hideMark/>
+          </w:tcPr>
+          <w:p>
+            <w:pPr>
+              <w:spacing w:after="160" w:line="278" w:lineRule="auto"/>
+            </w:pPr>
+            <w:r>
+              <w:t xml:space="preserve">Cache-entry ID remains the same, Lifecycle ID remains the same. </w:t>
+            </w:r>
+          </w:p>
+        </w:tc>
+        <w:tc>
+          <w:tcPr>
+            <w:tcW w:w="1260" w:type="dxa"/>
+            <w:hideMark/>
+          </w:tcPr>
+          <w:p>
+            <w:pPr>
+              <w:spacing w:after="160" w:line="278" w:lineRule="auto"/>
+            </w:pPr>
+            <w:r>
+              <w:rPr>
+                <w:b/>
+                <w:bCs/>
+              </w:rPr>
+              <w:t>Pass</w:t>
+            </w:r>
+            <w:r>
+              <w:t xml:space="preserve"> (</w:t>
+            </w:r>
+            <w:r>
+              <w:t>Confirms cache reuse.</w:t>
+            </w:r>
+            <w:r>
+              <w:t>)</w:t>
+            </w:r>
+          </w:p>
+        </w:tc>
+      </w:tr>
+      <w:tr>
+        <w:tc>
+          <w:tcPr>
+            <w:tcW w:w="1795" w:type="dxa"/>
+            <w:hideMark/>
+          </w:tcPr>
+          <w:p>
+            <w:pPr>
+              <w:spacing w:after="160" w:line="278" w:lineRule="auto"/>
+            </w:pPr>
+            <w:r>
+              <w:t>Cached (</w:t>
+            </w:r>
+            <w:proofErr w:type="spellStart"/>
+            <w:r>
+              <w:t>VaryByCookie</w:t>
+            </w:r>
+            <w:proofErr w:type="spellEnd"/>
+            <w:r>
+              <w:t>="price-selection")</w:t>
+            </w:r>
+          </w:p>
+        </w:tc>
+        <w:tc>
+          <w:tcPr>
+            <w:tcW w:w="1170" w:type="dxa"/>
+            <w:hideMark/>
+          </w:tcPr>
+          <w:p>
+            <w:pPr>
+              <w:spacing w:after="160" w:line="278" w:lineRule="auto"/>
+            </w:pPr>
+            <w:r>
+              <w:t>3 (Cold)</w:t>
+            </w:r>
+          </w:p>
+        </w:tc>
+        <w:tc>
+          <w:tcPr>
+            <w:tcW w:w="1170" w:type="dxa"/>
+            <w:hideMark/>
+          </w:tcPr>
+          <w:p>
+            <w:pPr>
+              <w:spacing w:after="160" w:line="278" w:lineRule="auto"/>
+            </w:pPr>
+            <w:r>
+              <w:t>premium</w:t>
+            </w:r>
+          </w:p>
+        </w:tc>
+        <w:tc>
+          <w:tcPr>
+            <w:tcW w:w="1306" w:type="dxa"/>
+            <w:hideMark/>
+          </w:tcPr>
+          <w:p>
+            <w:pPr>
+              <w:spacing w:after="160" w:line="278" w:lineRule="auto"/>
+            </w:pPr>
+            <w:r>
+              <w:t>d6b0171c-bf14-4dd7-a3db-cdfc6b5f5358</w:t>
+            </w:r>
+          </w:p>
+        </w:tc>
+        <w:tc>
+          <w:tcPr>
+            <w:tcW w:w="1304" w:type="dxa"/>
+            <w:hideMark/>
+          </w:tcPr>
+          <w:p>
+            <w:pPr>
+              <w:spacing w:after="160" w:line="278" w:lineRule="auto"/>
+            </w:pPr>
+            <w:r>
+              <w:t>7b58e81c-d10a-42d4-b56d-b0eb667ddadb</w:t>
+            </w:r>
+          </w:p>
+        </w:tc>
+        <w:tc>
+          <w:tcPr>
+            <w:tcW w:w="1620" w:type="dxa"/>
+            <w:hideMark/>
+          </w:tcPr>
+          <w:p>
+            <w:pPr>
+              <w:spacing w:after="160" w:line="278" w:lineRule="auto"/>
+            </w:pPr>
+            <w:r>
+              <w:t xml:space="preserve">New cookie value produces a different cache entry </w:t>
+            </w:r>
+            <w:r>
+              <w:lastRenderedPageBreak/>
+              <w:t>and lifecycle identifier</w:t>
+            </w:r>
+            <w:r>
+              <w:t xml:space="preserve">. </w:t>
+            </w:r>
+          </w:p>
+        </w:tc>
+        <w:tc>
+          <w:tcPr>
+            <w:tcW w:w="1260" w:type="dxa"/>
+            <w:hideMark/>
+          </w:tcPr>
+          <w:p>
+            <w:pPr>
+              <w:spacing w:after="160" w:line="278" w:lineRule="auto"/>
+            </w:pPr>
+            <w:r>
+              <w:rPr>
+                <w:b/>
+                <w:bCs/>
+              </w:rPr>
+              <w:lastRenderedPageBreak/>
+              <w:t>Pass</w:t>
+            </w:r>
+            <w:r>
+              <w:rPr>
+                <w:b/>
+                <w:bCs/>
+              </w:rPr>
+              <w:t xml:space="preserve"> </w:t>
+            </w:r>
+            <w:r>
+              <w:t>(</w:t>
+            </w:r>
+            <w:r>
+              <w:t xml:space="preserve">Confirms a distinct cache entry is created </w:t>
+            </w:r>
+            <w:r>
+              <w:lastRenderedPageBreak/>
+              <w:t>per cookie value.</w:t>
+            </w:r>
+            <w:r>
+              <w:t>)</w:t>
+            </w:r>
+          </w:p>
+        </w:tc>
+      </w:tr>
+      <w:tr>
+        <w:tc>
+          <w:tcPr>
+            <w:tcW w:w="1795" w:type="dxa"/>
+            <w:hideMark/>
+          </w:tcPr>
+          <w:p>
+            <w:pPr>
+              <w:spacing w:after="160" w:line="278" w:lineRule="auto"/>
+            </w:pPr>
+            <w:r>
+              <w:lastRenderedPageBreak/>
+              <w:t>Cached (</w:t>
+            </w:r>
+            <w:proofErr w:type="spellStart"/>
+            <w:r>
+              <w:t>VaryByCookie</w:t>
+            </w:r>
+            <w:proofErr w:type="spellEnd"/>
+            <w:r>
+              <w:t>="price-selection")</w:t>
+            </w:r>
+          </w:p>
+        </w:tc>
+        <w:tc>
+          <w:tcPr>
+            <w:tcW w:w="1170" w:type="dxa"/>
+            <w:hideMark/>
+          </w:tcPr>
+          <w:p>
+            <w:pPr>
+              <w:spacing w:after="160" w:line="278" w:lineRule="auto"/>
+            </w:pPr>
+            <w:r>
+              <w:t>4 (Refresh)</w:t>
+            </w:r>
+          </w:p>
+        </w:tc>
+        <w:tc>
+          <w:tcPr>
+            <w:tcW w:w="1170" w:type="dxa"/>
+            <w:hideMark/>
+          </w:tcPr>
+          <w:p>
+            <w:pPr>
+              <w:spacing w:after="160" w:line="278" w:lineRule="auto"/>
+            </w:pPr>
+            <w:r>
+              <w:t>premium</w:t>
+            </w:r>
+          </w:p>
+        </w:tc>
+        <w:tc>
+          <w:tcPr>
+            <w:tcW w:w="1306" w:type="dxa"/>
+            <w:hideMark/>
+          </w:tcPr>
+          <w:p>
+            <w:pPr>
+              <w:spacing w:after="160" w:line="278" w:lineRule="auto"/>
+            </w:pPr>
+            <w:r>
+              <w:t>d6b0171c-bf14-4dd7-a3db-cdfc6b5f5358</w:t>
+            </w:r>
+          </w:p>
+        </w:tc>
+        <w:tc>
+          <w:tcPr>
+            <w:tcW w:w="1304" w:type="dxa"/>
+            <w:hideMark/>
+          </w:tcPr>
+          <w:p>
+            <w:pPr>
+              <w:spacing w:after="160" w:line="278" w:lineRule="auto"/>
+            </w:pPr>
+            <w:r>
+              <w:t>7b58e81c-d10a-42d4-b56d-b0eb667ddadb</w:t>
+            </w:r>
+          </w:p>
+        </w:tc>
+        <w:tc>
+          <w:tcPr>
+            <w:tcW w:w="1620" w:type="dxa"/>
+            <w:hideMark/>
+          </w:tcPr>
+          <w:p>
+            <w:pPr>
+              <w:spacing w:after="160" w:line="278" w:lineRule="auto"/>
+            </w:pPr>
+            <w:r>
+              <w:t xml:space="preserve">Cache-entry ID remains the same, Lifecycle ID remains the same. </w:t>
+            </w:r>
+          </w:p>
+        </w:tc>
+        <w:tc>
+          <w:tcPr>
+            <w:tcW w:w="1260" w:type="dxa"/>
+            <w:hideMark/>
+          </w:tcPr>
+          <w:p>
+            <w:pPr>
+              <w:spacing w:after="160" w:line="278" w:lineRule="auto"/>
+            </w:pPr>
+            <w:r>
+              <w:rPr>
+                <w:b/>
+                <w:bCs/>
+              </w:rPr>
+              <w:t>Pass</w:t>
+            </w:r>
+            <w:r>
+              <w:t xml:space="preserve"> (</w:t>
+            </w:r>
+            <w:r>
+              <w:t>Confirms cached premium entry reuse.</w:t>
+            </w:r>
+            <w:r>
+              <w:t>)</w:t>
+            </w:r>
+          </w:p>
+        </w:tc>
+      </w:tr>
+    </w:tbl>
+    <w:p/>
+    <w:p>
+      <w:pPr>
+        <w:rPr>
+          <w:b/>
+          <w:bCs/>
+          <w:sz w:val="32"/>
+          <w:szCs w:val="32"/>
+        </w:rPr>
+      </w:pPr>
+      <w:r>
+        <w:rPr>
+          <w:b/>
+          <w:bCs/>
+          <w:sz w:val="32"/>
+          <w:szCs w:val="32"/>
+        </w:rPr>
+        <w:t>Documentation Assessment</w:t>
+      </w:r>
+    </w:p>
+    <w:p>
+      <w:r>
+        <w:rPr>
+          <w:b/>
+          <w:bCs/>
+        </w:rPr>
+        <w:t>Reviewed Documentation:</w:t>
+      </w:r>
+      <w:r>
+        <w:rPr>
+          <w:b/>
+          <w:bCs/>
+        </w:rPr>
+        <w:t xml:space="preserve"> </w:t>
+      </w:r>
+      <w:hyperlink r:id="rId28" w:history="1">
         <w:r>
           <w:rPr>
             <w:rStyle w:val="Hyperlink"/>
@@ -3682,6 +4891,7 @@
         <w:t xml:space="preserve"> and caching behavior, unconditional refusal scenarios, or the actionable exception-message expectations validated by this issue.</w:t>
       </w:r>
     </w:p>
+    <w:p/>
     <w:p>
       <w:pPr>
         <w:rPr>
@@ -3732,7 +4942,28 @@
         <w:spacing w:line="240" w:lineRule="auto"/>
       </w:pPr>
       <w:r>
+        <w:t>Build</w:t>
+      </w:r>
+      <w:r>
+        <w:t xml:space="preserve"> </w:t>
+      </w:r>
+      <w:r>
         <w:t xml:space="preserve">Warnings: </w:t>
+      </w:r>
+      <w:r>
+        <w:t>0</w:t>
+      </w:r>
+    </w:p>
+    <w:p>
+      <w:pPr>
+        <w:numPr>
+          <w:ilvl w:val="0"/>
+          <w:numId w:val="3"/>
+        </w:numPr>
+        <w:spacing w:line="240" w:lineRule="auto"/>
+      </w:pPr>
+      <w:r>
+        <w:t>Runtime warnings: 1</w:t>
       </w:r>
     </w:p>
     <w:p>
@@ -3775,15 +5006,25 @@
           <w:p>
             <w:pPr>
               <w:ind w:left="360"/>
-            </w:pPr>
-            <w:proofErr w:type="spellStart"/>
-            <w:proofErr w:type="gramStart"/>
-            <w:r>
+              <w:rPr>
+                <w:i/>
+                <w:iCs/>
+              </w:rPr>
+            </w:pPr>
+            <w:proofErr w:type="spellStart"/>
+            <w:r>
+              <w:rPr>
+                <w:i/>
+                <w:iCs/>
+              </w:rPr>
               <w:t>Microsoft.AspNetCore.HttpsPolicy.HttpsRedirectionMiddleware</w:t>
             </w:r>
             <w:proofErr w:type="spellEnd"/>
-            <w:proofErr w:type="gramEnd"/>
-            <w:r>
+            <w:r>
+              <w:rPr>
+                <w:i/>
+                <w:iCs/>
+              </w:rPr>
               <w:t>[3]</w:t>
             </w:r>
           </w:p>
@@ -3797,8 +5038,16 @@
           <w:p>
             <w:pPr>
               <w:ind w:left="360"/>
-            </w:pPr>
-            <w:r>
+              <w:rPr>
+                <w:i/>
+                <w:iCs/>
+              </w:rPr>
+            </w:pPr>
+            <w:r>
+              <w:rPr>
+                <w:i/>
+                <w:iCs/>
+              </w:rPr>
               <w:t>Failed to determine the https port for redirect.</w:t>
             </w:r>
           </w:p>
@@ -3814,7 +5063,6 @@
         <w:spacing w:line="240" w:lineRule="auto"/>
       </w:pPr>
       <w:r>
-        <w:lastRenderedPageBreak/>
         <w:t>This warning is unrelated to this validation.</w:t>
       </w:r>
     </w:p>
@@ -3842,7 +5090,7 @@
                     <pic:cNvPicPr/>
                   </pic:nvPicPr>
                   <pic:blipFill>
-                    <a:blip r:embed="rId25"/>
+                    <a:blip r:embed="rId29"/>
                     <a:stretch>
                       <a:fillRect/>
                     </a:stretch>
@@ -3875,6 +5123,11 @@
       <w:pPr>
         <w:spacing w:line="240" w:lineRule="auto"/>
       </w:pPr>
+    </w:p>
+    <w:p>
+      <w:pPr>
+        <w:spacing w:line="240" w:lineRule="auto"/>
+      </w:pPr>
       <w:r>
         <w:rPr>
           <w:b/>
@@ -3937,13 +5190,7 @@
         <w:spacing w:line="240" w:lineRule="auto"/>
       </w:pPr>
       <w:r>
-        <w:t xml:space="preserve">Static SSR was the only supported configuration required for this validation. No configuration-specific differences were </w:t>
-      </w:r>
-      <w:r>
-        <w:t>observed,</w:t>
-      </w:r>
-      <w:r>
-        <w:t xml:space="preserve"> and no additional render modes were applicable to this scenario.</w:t>
+        <w:t>Static SSR was the only supported configuration required for this validation. No configuration-specific differences were observed, and no additional render modes were applicable to this scenario.</w:t>
       </w:r>
     </w:p>
     <w:p>
@@ -4366,6 +5613,119 @@
     </w:lvl>
   </w:abstractNum>
   <w:abstractNum w:abstractNumId="4" w15:restartNumberingAfterBreak="0">
+    <w:nsid w:val="3E19124A"/>
+    <w:multiLevelType w:val="hybridMultilevel"/>
+    <w:tmpl w:val="C396F16C"/>
+    <w:lvl w:ilvl="0" w:tplc="04090001">
+      <w:start w:val="1"/>
+      <w:numFmt w:val="bullet"/>
+      <w:lvlText w:val=""/>
+      <w:lvlJc w:val="left"/>
+      <w:pPr>
+        <w:ind w:left="720" w:hanging="360"/>
+      </w:pPr>
+      <w:rPr>
+        <w:rFonts w:ascii="Symbol" w:hAnsi="Symbol" w:hint="default"/>
+      </w:rPr>
+    </w:lvl>
+    <w:lvl w:ilvl="1" w:tplc="04090003" w:tentative="1">
+      <w:start w:val="1"/>
+      <w:numFmt w:val="bullet"/>
+      <w:lvlText w:val="o"/>
+      <w:lvlJc w:val="left"/>
+      <w:pPr>
+        <w:ind w:left="1440" w:hanging="360"/>
+      </w:pPr>
+      <w:rPr>
+        <w:rFonts w:ascii="Courier New" w:hAnsi="Courier New" w:cs="Courier New" w:hint="default"/>
+      </w:rPr>
+    </w:lvl>
+    <w:lvl w:ilvl="2" w:tplc="04090005" w:tentative="1">
+      <w:start w:val="1"/>
+      <w:numFmt w:val="bullet"/>
+      <w:lvlText w:val=""/>
+      <w:lvlJc w:val="left"/>
+      <w:pPr>
+        <w:ind w:left="2160" w:hanging="360"/>
+      </w:pPr>
+      <w:rPr>
+        <w:rFonts w:ascii="Wingdings" w:hAnsi="Wingdings" w:hint="default"/>
+      </w:rPr>
+    </w:lvl>
+    <w:lvl w:ilvl="3" w:tplc="04090001" w:tentative="1">
+      <w:start w:val="1"/>
+      <w:numFmt w:val="bullet"/>
+      <w:lvlText w:val=""/>
+      <w:lvlJc w:val="left"/>
+      <w:pPr>
+        <w:ind w:left="2880" w:hanging="360"/>
+      </w:pPr>
+      <w:rPr>
+        <w:rFonts w:ascii="Symbol" w:hAnsi="Symbol" w:hint="default"/>
+      </w:rPr>
+    </w:lvl>
+    <w:lvl w:ilvl="4" w:tplc="04090003" w:tentative="1">
+      <w:start w:val="1"/>
+      <w:numFmt w:val="bullet"/>
+      <w:lvlText w:val="o"/>
+      <w:lvlJc w:val="left"/>
+      <w:pPr>
+        <w:ind w:left="3600" w:hanging="360"/>
+      </w:pPr>
+      <w:rPr>
+        <w:rFonts w:ascii="Courier New" w:hAnsi="Courier New" w:cs="Courier New" w:hint="default"/>
+      </w:rPr>
+    </w:lvl>
+    <w:lvl w:ilvl="5" w:tplc="04090005" w:tentative="1">
+      <w:start w:val="1"/>
+      <w:numFmt w:val="bullet"/>
+      <w:lvlText w:val=""/>
+      <w:lvlJc w:val="left"/>
+      <w:pPr>
+        <w:ind w:left="4320" w:hanging="360"/>
+      </w:pPr>
+      <w:rPr>
+        <w:rFonts w:ascii="Wingdings" w:hAnsi="Wingdings" w:hint="default"/>
+      </w:rPr>
+    </w:lvl>
+    <w:lvl w:ilvl="6" w:tplc="04090001" w:tentative="1">
+      <w:start w:val="1"/>
+      <w:numFmt w:val="bullet"/>
+      <w:lvlText w:val=""/>
+      <w:lvlJc w:val="left"/>
+      <w:pPr>
+        <w:ind w:left="5040" w:hanging="360"/>
+      </w:pPr>
+      <w:rPr>
+        <w:rFonts w:ascii="Symbol" w:hAnsi="Symbol" w:hint="default"/>
+      </w:rPr>
+    </w:lvl>
+    <w:lvl w:ilvl="7" w:tplc="04090003" w:tentative="1">
+      <w:start w:val="1"/>
+      <w:numFmt w:val="bullet"/>
+      <w:lvlText w:val="o"/>
+      <w:lvlJc w:val="left"/>
+      <w:pPr>
+        <w:ind w:left="5760" w:hanging="360"/>
+      </w:pPr>
+      <w:rPr>
+        <w:rFonts w:ascii="Courier New" w:hAnsi="Courier New" w:cs="Courier New" w:hint="default"/>
+      </w:rPr>
+    </w:lvl>
+    <w:lvl w:ilvl="8" w:tplc="04090005" w:tentative="1">
+      <w:start w:val="1"/>
+      <w:numFmt w:val="bullet"/>
+      <w:lvlText w:val=""/>
+      <w:lvlJc w:val="left"/>
+      <w:pPr>
+        <w:ind w:left="6480" w:hanging="360"/>
+      </w:pPr>
+      <w:rPr>
+        <w:rFonts w:ascii="Wingdings" w:hAnsi="Wingdings" w:hint="default"/>
+      </w:rPr>
+    </w:lvl>
+  </w:abstractNum>
+  <w:abstractNum w:abstractNumId="5" w15:restartNumberingAfterBreak="0">
     <w:nsid w:val="5C04609C"/>
     <w:multiLevelType w:val="multilevel"/>
     <w:tmpl w:val="FE743AC8"/>
@@ -4514,10 +5874,123 @@
       </w:rPr>
     </w:lvl>
   </w:abstractNum>
-  <w:abstractNum w:abstractNumId="5" w15:restartNumberingAfterBreak="0">
+  <w:abstractNum w:abstractNumId="6" w15:restartNumberingAfterBreak="0">
     <w:nsid w:val="70DE425F"/>
     <w:multiLevelType w:val="hybridMultilevel"/>
     <w:tmpl w:val="E294D9E6"/>
+    <w:lvl w:ilvl="0" w:tplc="04090001">
+      <w:start w:val="1"/>
+      <w:numFmt w:val="bullet"/>
+      <w:lvlText w:val=""/>
+      <w:lvlJc w:val="left"/>
+      <w:pPr>
+        <w:ind w:left="720" w:hanging="360"/>
+      </w:pPr>
+      <w:rPr>
+        <w:rFonts w:ascii="Symbol" w:hAnsi="Symbol" w:hint="default"/>
+      </w:rPr>
+    </w:lvl>
+    <w:lvl w:ilvl="1" w:tplc="04090003">
+      <w:start w:val="1"/>
+      <w:numFmt w:val="bullet"/>
+      <w:lvlText w:val="o"/>
+      <w:lvlJc w:val="left"/>
+      <w:pPr>
+        <w:ind w:left="1440" w:hanging="360"/>
+      </w:pPr>
+      <w:rPr>
+        <w:rFonts w:ascii="Courier New" w:hAnsi="Courier New" w:cs="Courier New" w:hint="default"/>
+      </w:rPr>
+    </w:lvl>
+    <w:lvl w:ilvl="2" w:tplc="04090005" w:tentative="1">
+      <w:start w:val="1"/>
+      <w:numFmt w:val="bullet"/>
+      <w:lvlText w:val=""/>
+      <w:lvlJc w:val="left"/>
+      <w:pPr>
+        <w:ind w:left="2160" w:hanging="360"/>
+      </w:pPr>
+      <w:rPr>
+        <w:rFonts w:ascii="Wingdings" w:hAnsi="Wingdings" w:hint="default"/>
+      </w:rPr>
+    </w:lvl>
+    <w:lvl w:ilvl="3" w:tplc="04090001" w:tentative="1">
+      <w:start w:val="1"/>
+      <w:numFmt w:val="bullet"/>
+      <w:lvlText w:val=""/>
+      <w:lvlJc w:val="left"/>
+      <w:pPr>
+        <w:ind w:left="2880" w:hanging="360"/>
+      </w:pPr>
+      <w:rPr>
+        <w:rFonts w:ascii="Symbol" w:hAnsi="Symbol" w:hint="default"/>
+      </w:rPr>
+    </w:lvl>
+    <w:lvl w:ilvl="4" w:tplc="04090003" w:tentative="1">
+      <w:start w:val="1"/>
+      <w:numFmt w:val="bullet"/>
+      <w:lvlText w:val="o"/>
+      <w:lvlJc w:val="left"/>
+      <w:pPr>
+        <w:ind w:left="3600" w:hanging="360"/>
+      </w:pPr>
+      <w:rPr>
+        <w:rFonts w:ascii="Courier New" w:hAnsi="Courier New" w:cs="Courier New" w:hint="default"/>
+      </w:rPr>
+    </w:lvl>
+    <w:lvl w:ilvl="5" w:tplc="04090005" w:tentative="1">
+      <w:start w:val="1"/>
+      <w:numFmt w:val="bullet"/>
+      <w:lvlText w:val=""/>
+      <w:lvlJc w:val="left"/>
+      <w:pPr>
+        <w:ind w:left="4320" w:hanging="360"/>
+      </w:pPr>
+      <w:rPr>
+        <w:rFonts w:ascii="Wingdings" w:hAnsi="Wingdings" w:hint="default"/>
+      </w:rPr>
+    </w:lvl>
+    <w:lvl w:ilvl="6" w:tplc="04090001" w:tentative="1">
+      <w:start w:val="1"/>
+      <w:numFmt w:val="bullet"/>
+      <w:lvlText w:val=""/>
+      <w:lvlJc w:val="left"/>
+      <w:pPr>
+        <w:ind w:left="5040" w:hanging="360"/>
+      </w:pPr>
+      <w:rPr>
+        <w:rFonts w:ascii="Symbol" w:hAnsi="Symbol" w:hint="default"/>
+      </w:rPr>
+    </w:lvl>
+    <w:lvl w:ilvl="7" w:tplc="04090003" w:tentative="1">
+      <w:start w:val="1"/>
+      <w:numFmt w:val="bullet"/>
+      <w:lvlText w:val="o"/>
+      <w:lvlJc w:val="left"/>
+      <w:pPr>
+        <w:ind w:left="5760" w:hanging="360"/>
+      </w:pPr>
+      <w:rPr>
+        <w:rFonts w:ascii="Courier New" w:hAnsi="Courier New" w:cs="Courier New" w:hint="default"/>
+      </w:rPr>
+    </w:lvl>
+    <w:lvl w:ilvl="8" w:tplc="04090005" w:tentative="1">
+      <w:start w:val="1"/>
+      <w:numFmt w:val="bullet"/>
+      <w:lvlText w:val=""/>
+      <w:lvlJc w:val="left"/>
+      <w:pPr>
+        <w:ind w:left="6480" w:hanging="360"/>
+      </w:pPr>
+      <w:rPr>
+        <w:rFonts w:ascii="Wingdings" w:hAnsi="Wingdings" w:hint="default"/>
+      </w:rPr>
+    </w:lvl>
+  </w:abstractNum>
+  <w:abstractNum w:abstractNumId="7" w15:restartNumberingAfterBreak="0">
+    <w:nsid w:val="7D185EE2"/>
+    <w:multiLevelType w:val="hybridMultilevel"/>
+    <w:tmpl w:val="920EB9B8"/>
     <w:lvl w:ilvl="0" w:tplc="04090001">
       <w:start w:val="1"/>
       <w:numFmt w:val="bullet"/>
@@ -4627,7 +6100,7 @@
       </w:rPr>
     </w:lvl>
   </w:abstractNum>
-  <w:abstractNum w:abstractNumId="6" w15:restartNumberingAfterBreak="0">
+  <w:abstractNum w:abstractNumId="8" w15:restartNumberingAfterBreak="0">
     <w:nsid w:val="7F583735"/>
     <w:multiLevelType w:val="multilevel"/>
     <w:tmpl w:val="58345F60"/>
@@ -4777,16 +6250,16 @@
     </w:lvl>
   </w:abstractNum>
   <w:num w:numId="1" w16cid:durableId="835611551">
-    <w:abstractNumId w:val="6"/>
+    <w:abstractNumId w:val="8"/>
   </w:num>
   <w:num w:numId="2" w16cid:durableId="782112220">
     <w:abstractNumId w:val="3"/>
   </w:num>
   <w:num w:numId="3" w16cid:durableId="1241217463">
-    <w:abstractNumId w:val="4"/>
+    <w:abstractNumId w:val="5"/>
   </w:num>
   <w:num w:numId="4" w16cid:durableId="1137726542">
-    <w:abstractNumId w:val="5"/>
+    <w:abstractNumId w:val="6"/>
   </w:num>
   <w:num w:numId="5" w16cid:durableId="17438014">
     <w:abstractNumId w:val="2"/>
@@ -4808,6 +6281,12 @@
   </w:num>
   <w:num w:numId="7" w16cid:durableId="1375352158">
     <w:abstractNumId w:val="1"/>
+  </w:num>
+  <w:num w:numId="8" w16cid:durableId="819929137">
+    <w:abstractNumId w:val="4"/>
+  </w:num>
+  <w:num w:numId="9" w16cid:durableId="1298755474">
+    <w:abstractNumId w:val="7"/>
   </w:num>
 </w:numbering>
 </file>

</xml_diff>